<commit_message>
docs: unir plan de pruebas y formato estándar en un solo documento
El plan de pruebas y el Formato de Caso de Prueba Estándar quedan en
Plan_Pruebas_y_Formato_Estandar_POS_Web.docx, con los tres módulos
probados con Jest:

- Módulo 1 · Autenticación (CP-LOGIN-001 a CP-REG-002), actualizado a
  Tienda Bugambilias y a la API actual, con los mensajes reales.
- Módulo 2 · Gestión de Productos (CP-PROD-001 a 005).
- Módulo 4 · Cálculo de Ganancias (CP-GAN-001 a 004).

Se eliminan Formato_Caso_Prueba_Estandar.docx (todavía decía «Sistema de
Restaurante») y Formato_Casos_Prueba_POS_Web.docx, cuyo contenido pasa al
documento unido. Se ignoran los archivos temporales de Word (~$*).

Co-Authored-By: Claude Opus 5.5 <noreply@anthropic.com>
</commit_message>
<xml_diff>
--- a/Plan_Pruebas_y_Formato_Estandar_POS_Web.docx
+++ b/Plan_Pruebas_y_Formato_Estandar_POS_Web.docx
@@ -109,7 +109,7 @@
           <w:i/>
           <w:sz w:val="22"/>
         </w:rPr>
-        <w:t>Módulo 2: Gestión de Productos · Módulo 4: Cálculo de Ganancias</w:t>
+        <w:t>Módulo 1: Autenticación · Módulo 2: Gestión de Productos · Módulo 4: Cálculo de Ganancias</w:t>
       </w:r>
     </w:p>
     <w:p>
@@ -187,7 +187,7 @@
         <w:spacing w:before="0" w:after="120"/>
       </w:pPr>
       <w:r>
-        <w:t>Verificar que los módulos de Gestión de Productos y Cálculo de Ganancias del sistema de la Tienda Bugambilias cumplen los requerimientos del dueño (RF1, RF2, RF3, RF5, RF7 y RF8 del documento «Objetivos del proyecto»), ejecutando los casos de prueba planificados con una herramienta automatizada y registrando el resultado de cada uno en el Formato de Caso de Prueba Estándar.</w:t>
+        <w:t>Verificar que los módulos de Autenticación, Gestión de Productos y Cálculo de Ganancias del sistema de la Tienda Bugambilias cumplen los requerimientos del dueño (RF1, RF2, RF3, RF5, RF7 y RF8 del documento «Objetivos del proyecto»), ejecutando los casos de prueba planificados con una herramienta automatizada y registrando el resultado de cada uno en el Formato de Caso de Prueba Estándar.</w:t>
       </w:r>
     </w:p>
     <w:p>
@@ -201,6 +201,24 @@
           <w:sz w:val="25"/>
         </w:rPr>
         <w:t>1.2 Alcance</w:t>
+      </w:r>
+    </w:p>
+    <w:p>
+      <w:pPr>
+        <w:spacing w:after="60"/>
+        <w:ind w:left="454" w:hanging="255"/>
+      </w:pPr>
+      <w:r>
+        <w:t xml:space="preserve">•  </w:t>
+      </w:r>
+      <w:r>
+        <w:rPr>
+          <w:b/>
+        </w:rPr>
+        <w:t xml:space="preserve">Módulo 1 · Autenticación (Login y Registro): </w:t>
+      </w:r>
+      <w:r>
+        <w:t>inicio de sesión con correo y contraseña, validación de campos y registro de nuevos usuarios con rol cajero.</w:t>
       </w:r>
     </w:p>
     <w:p>
@@ -237,24 +255,6 @@
       </w:r>
       <w:r>
         <w:t>ganancia por unidad (venta − compra), margen, ganancia negativa y reporte de productos más y menos rentables.</w:t>
-      </w:r>
-    </w:p>
-    <w:p>
-      <w:pPr>
-        <w:spacing w:after="60"/>
-        <w:ind w:left="454" w:hanging="255"/>
-      </w:pPr>
-      <w:r>
-        <w:t xml:space="preserve">•  </w:t>
-      </w:r>
-      <w:r>
-        <w:rPr>
-          <w:b/>
-        </w:rPr>
-        <w:t xml:space="preserve">Módulo 1 · Autenticación: </w:t>
-      </w:r>
-      <w:r>
-        <w:t>ya documentado en «Formato_Casos_Prueba_POS_Web» (CP-LOGIN-001 a CP-REG-002); se vuelve a ejecutar como regresión.</w:t>
       </w:r>
     </w:p>
     <w:p>
@@ -456,7 +456,7 @@
               <w:rPr>
                 <w:sz w:val="18"/>
               </w:rPr>
-              <w:t>CP-PROD-001, 002, 003 y CP-GAN-002: se crea, edita, elimina y vende como lo haría el usuario, y se revisa la respuesta de la API.</w:t>
+              <w:t>Módulo 1 completo (CP-LOGIN y CP-REG), CP-PROD-001, 002, 003 y CP-GAN-002: se inicia sesión, se registra, se crea, edita, elimina y vende como lo haría el usuario, y se revisa la respuesta de la API.</w:t>
             </w:r>
           </w:p>
         </w:tc>
@@ -731,7 +731,7 @@
         </w:tc>
         <w:tc>
           <w:tcPr>
-            <w:tcW w:type="dxa" w:w="1247"/>
+            <w:tcW w:type="dxa" w:w="1474"/>
             <w:shd w:val="clear" w:color="auto" w:fill="EDEDED"/>
           </w:tcPr>
           <w:p>
@@ -746,7 +746,7 @@
         </w:tc>
         <w:tc>
           <w:tcPr>
-            <w:tcW w:type="dxa" w:w="4309"/>
+            <w:tcW w:type="dxa" w:w="4082"/>
             <w:shd w:val="clear" w:color="auto" w:fill="EDEDED"/>
           </w:tcPr>
           <w:p>
@@ -800,13 +800,348 @@
               <w:rPr>
                 <w:sz w:val="18"/>
               </w:rPr>
+              <w:t>CP-LOGIN-001</w:t>
+            </w:r>
+          </w:p>
+        </w:tc>
+        <w:tc>
+          <w:tcPr>
+            <w:tcW w:type="dxa" w:w="1474"/>
+          </w:tcPr>
+          <w:p>
+            <w:r>
+              <w:rPr>
+                <w:sz w:val="18"/>
+              </w:rPr>
+              <w:t>Autenticación</w:t>
+            </w:r>
+          </w:p>
+        </w:tc>
+        <w:tc>
+          <w:tcPr>
+            <w:tcW w:type="dxa" w:w="4082"/>
+          </w:tcPr>
+          <w:p>
+            <w:r>
+              <w:rPr>
+                <w:sz w:val="18"/>
+              </w:rPr>
+              <w:t>Inicio de sesión con credenciales correctas</w:t>
+            </w:r>
+          </w:p>
+        </w:tc>
+        <w:tc>
+          <w:tcPr>
+            <w:tcW w:type="dxa" w:w="1134"/>
+          </w:tcPr>
+          <w:p>
+            <w:r>
+              <w:rPr>
+                <w:sz w:val="18"/>
+              </w:rPr>
+              <w:t>Positiva</w:t>
+            </w:r>
+          </w:p>
+        </w:tc>
+        <w:tc>
+          <w:tcPr>
+            <w:tcW w:type="dxa" w:w="1361"/>
+          </w:tcPr>
+          <w:p>
+            <w:r>
+              <w:rPr>
+                <w:sz w:val="18"/>
+              </w:rPr>
+              <w:t>Caja negra</w:t>
+            </w:r>
+          </w:p>
+        </w:tc>
+      </w:tr>
+      <w:tr>
+        <w:tc>
+          <w:tcPr>
+            <w:tcW w:type="dxa" w:w="1474"/>
+          </w:tcPr>
+          <w:p>
+            <w:r>
+              <w:rPr>
+                <w:sz w:val="18"/>
+              </w:rPr>
+              <w:t>CP-LOGIN-002</w:t>
+            </w:r>
+          </w:p>
+        </w:tc>
+        <w:tc>
+          <w:tcPr>
+            <w:tcW w:type="dxa" w:w="1474"/>
+          </w:tcPr>
+          <w:p>
+            <w:r>
+              <w:rPr>
+                <w:sz w:val="18"/>
+              </w:rPr>
+              <w:t>Autenticación</w:t>
+            </w:r>
+          </w:p>
+        </w:tc>
+        <w:tc>
+          <w:tcPr>
+            <w:tcW w:type="dxa" w:w="4082"/>
+          </w:tcPr>
+          <w:p>
+            <w:r>
+              <w:rPr>
+                <w:sz w:val="18"/>
+              </w:rPr>
+              <w:t>Fallo por contraseña incorrecta</w:t>
+            </w:r>
+          </w:p>
+        </w:tc>
+        <w:tc>
+          <w:tcPr>
+            <w:tcW w:type="dxa" w:w="1134"/>
+          </w:tcPr>
+          <w:p>
+            <w:r>
+              <w:rPr>
+                <w:sz w:val="18"/>
+              </w:rPr>
+              <w:t>Negativa</w:t>
+            </w:r>
+          </w:p>
+        </w:tc>
+        <w:tc>
+          <w:tcPr>
+            <w:tcW w:type="dxa" w:w="1361"/>
+          </w:tcPr>
+          <w:p>
+            <w:r>
+              <w:rPr>
+                <w:sz w:val="18"/>
+              </w:rPr>
+              <w:t>Caja negra</w:t>
+            </w:r>
+          </w:p>
+        </w:tc>
+      </w:tr>
+      <w:tr>
+        <w:tc>
+          <w:tcPr>
+            <w:tcW w:type="dxa" w:w="1474"/>
+          </w:tcPr>
+          <w:p>
+            <w:r>
+              <w:rPr>
+                <w:sz w:val="18"/>
+              </w:rPr>
+              <w:t>CP-LOGIN-003</w:t>
+            </w:r>
+          </w:p>
+        </w:tc>
+        <w:tc>
+          <w:tcPr>
+            <w:tcW w:type="dxa" w:w="1474"/>
+          </w:tcPr>
+          <w:p>
+            <w:r>
+              <w:rPr>
+                <w:sz w:val="18"/>
+              </w:rPr>
+              <w:t>Autenticación</w:t>
+            </w:r>
+          </w:p>
+        </w:tc>
+        <w:tc>
+          <w:tcPr>
+            <w:tcW w:type="dxa" w:w="4082"/>
+          </w:tcPr>
+          <w:p>
+            <w:r>
+              <w:rPr>
+                <w:sz w:val="18"/>
+              </w:rPr>
+              <w:t>Validación de campos vacíos</w:t>
+            </w:r>
+          </w:p>
+        </w:tc>
+        <w:tc>
+          <w:tcPr>
+            <w:tcW w:type="dxa" w:w="1134"/>
+          </w:tcPr>
+          <w:p>
+            <w:r>
+              <w:rPr>
+                <w:sz w:val="18"/>
+              </w:rPr>
+              <w:t>Negativa</w:t>
+            </w:r>
+          </w:p>
+        </w:tc>
+        <w:tc>
+          <w:tcPr>
+            <w:tcW w:type="dxa" w:w="1361"/>
+          </w:tcPr>
+          <w:p>
+            <w:r>
+              <w:rPr>
+                <w:sz w:val="18"/>
+              </w:rPr>
+              <w:t>Caja negra</w:t>
+            </w:r>
+          </w:p>
+        </w:tc>
+      </w:tr>
+      <w:tr>
+        <w:tc>
+          <w:tcPr>
+            <w:tcW w:type="dxa" w:w="1474"/>
+          </w:tcPr>
+          <w:p>
+            <w:r>
+              <w:rPr>
+                <w:sz w:val="18"/>
+              </w:rPr>
+              <w:t>CP-REG-001</w:t>
+            </w:r>
+          </w:p>
+        </w:tc>
+        <w:tc>
+          <w:tcPr>
+            <w:tcW w:type="dxa" w:w="1474"/>
+          </w:tcPr>
+          <w:p>
+            <w:r>
+              <w:rPr>
+                <w:sz w:val="18"/>
+              </w:rPr>
+              <w:t>Autenticación</w:t>
+            </w:r>
+          </w:p>
+        </w:tc>
+        <w:tc>
+          <w:tcPr>
+            <w:tcW w:type="dxa" w:w="4082"/>
+          </w:tcPr>
+          <w:p>
+            <w:r>
+              <w:rPr>
+                <w:sz w:val="18"/>
+              </w:rPr>
+              <w:t>Registro exitoso de un nuevo usuario</w:t>
+            </w:r>
+          </w:p>
+        </w:tc>
+        <w:tc>
+          <w:tcPr>
+            <w:tcW w:type="dxa" w:w="1134"/>
+          </w:tcPr>
+          <w:p>
+            <w:r>
+              <w:rPr>
+                <w:sz w:val="18"/>
+              </w:rPr>
+              <w:t>Positiva</w:t>
+            </w:r>
+          </w:p>
+        </w:tc>
+        <w:tc>
+          <w:tcPr>
+            <w:tcW w:type="dxa" w:w="1361"/>
+          </w:tcPr>
+          <w:p>
+            <w:r>
+              <w:rPr>
+                <w:sz w:val="18"/>
+              </w:rPr>
+              <w:t>Caja negra</w:t>
+            </w:r>
+          </w:p>
+        </w:tc>
+      </w:tr>
+      <w:tr>
+        <w:tc>
+          <w:tcPr>
+            <w:tcW w:type="dxa" w:w="1474"/>
+          </w:tcPr>
+          <w:p>
+            <w:r>
+              <w:rPr>
+                <w:sz w:val="18"/>
+              </w:rPr>
+              <w:t>CP-REG-002</w:t>
+            </w:r>
+          </w:p>
+        </w:tc>
+        <w:tc>
+          <w:tcPr>
+            <w:tcW w:type="dxa" w:w="1474"/>
+          </w:tcPr>
+          <w:p>
+            <w:r>
+              <w:rPr>
+                <w:sz w:val="18"/>
+              </w:rPr>
+              <w:t>Autenticación</w:t>
+            </w:r>
+          </w:p>
+        </w:tc>
+        <w:tc>
+          <w:tcPr>
+            <w:tcW w:type="dxa" w:w="4082"/>
+          </w:tcPr>
+          <w:p>
+            <w:r>
+              <w:rPr>
+                <w:sz w:val="18"/>
+              </w:rPr>
+              <w:t>Rechazo por correo ya registrado</w:t>
+            </w:r>
+          </w:p>
+        </w:tc>
+        <w:tc>
+          <w:tcPr>
+            <w:tcW w:type="dxa" w:w="1134"/>
+          </w:tcPr>
+          <w:p>
+            <w:r>
+              <w:rPr>
+                <w:sz w:val="18"/>
+              </w:rPr>
+              <w:t>Negativa</w:t>
+            </w:r>
+          </w:p>
+        </w:tc>
+        <w:tc>
+          <w:tcPr>
+            <w:tcW w:type="dxa" w:w="1361"/>
+          </w:tcPr>
+          <w:p>
+            <w:r>
+              <w:rPr>
+                <w:sz w:val="18"/>
+              </w:rPr>
+              <w:t>Caja negra</w:t>
+            </w:r>
+          </w:p>
+        </w:tc>
+      </w:tr>
+      <w:tr>
+        <w:tc>
+          <w:tcPr>
+            <w:tcW w:type="dxa" w:w="1474"/>
+          </w:tcPr>
+          <w:p>
+            <w:r>
+              <w:rPr>
+                <w:sz w:val="18"/>
+              </w:rPr>
               <w:t>CP-PROD-001</w:t>
             </w:r>
           </w:p>
         </w:tc>
         <w:tc>
           <w:tcPr>
-            <w:tcW w:type="dxa" w:w="1247"/>
+            <w:tcW w:type="dxa" w:w="1474"/>
           </w:tcPr>
           <w:p>
             <w:r>
@@ -819,7 +1154,7 @@
         </w:tc>
         <w:tc>
           <w:tcPr>
-            <w:tcW w:type="dxa" w:w="4309"/>
+            <w:tcW w:type="dxa" w:w="4082"/>
           </w:tcPr>
           <w:p>
             <w:r>
@@ -873,7 +1208,7 @@
         </w:tc>
         <w:tc>
           <w:tcPr>
-            <w:tcW w:type="dxa" w:w="1247"/>
+            <w:tcW w:type="dxa" w:w="1474"/>
           </w:tcPr>
           <w:p>
             <w:r>
@@ -886,7 +1221,7 @@
         </w:tc>
         <w:tc>
           <w:tcPr>
-            <w:tcW w:type="dxa" w:w="4309"/>
+            <w:tcW w:type="dxa" w:w="4082"/>
           </w:tcPr>
           <w:p>
             <w:r>
@@ -940,7 +1275,7 @@
         </w:tc>
         <w:tc>
           <w:tcPr>
-            <w:tcW w:type="dxa" w:w="1247"/>
+            <w:tcW w:type="dxa" w:w="1474"/>
           </w:tcPr>
           <w:p>
             <w:r>
@@ -953,7 +1288,7 @@
         </w:tc>
         <w:tc>
           <w:tcPr>
-            <w:tcW w:type="dxa" w:w="4309"/>
+            <w:tcW w:type="dxa" w:w="4082"/>
           </w:tcPr>
           <w:p>
             <w:r>
@@ -1007,7 +1342,7 @@
         </w:tc>
         <w:tc>
           <w:tcPr>
-            <w:tcW w:type="dxa" w:w="1247"/>
+            <w:tcW w:type="dxa" w:w="1474"/>
           </w:tcPr>
           <w:p>
             <w:r>
@@ -1020,7 +1355,7 @@
         </w:tc>
         <w:tc>
           <w:tcPr>
-            <w:tcW w:type="dxa" w:w="4309"/>
+            <w:tcW w:type="dxa" w:w="4082"/>
           </w:tcPr>
           <w:p>
             <w:r>
@@ -1074,7 +1409,7 @@
         </w:tc>
         <w:tc>
           <w:tcPr>
-            <w:tcW w:type="dxa" w:w="1247"/>
+            <w:tcW w:type="dxa" w:w="1474"/>
           </w:tcPr>
           <w:p>
             <w:r>
@@ -1087,7 +1422,7 @@
         </w:tc>
         <w:tc>
           <w:tcPr>
-            <w:tcW w:type="dxa" w:w="4309"/>
+            <w:tcW w:type="dxa" w:w="4082"/>
           </w:tcPr>
           <w:p>
             <w:r>
@@ -1141,7 +1476,7 @@
         </w:tc>
         <w:tc>
           <w:tcPr>
-            <w:tcW w:type="dxa" w:w="1247"/>
+            <w:tcW w:type="dxa" w:w="1474"/>
           </w:tcPr>
           <w:p>
             <w:r>
@@ -1154,7 +1489,7 @@
         </w:tc>
         <w:tc>
           <w:tcPr>
-            <w:tcW w:type="dxa" w:w="4309"/>
+            <w:tcW w:type="dxa" w:w="4082"/>
           </w:tcPr>
           <w:p>
             <w:r>
@@ -1208,7 +1543,7 @@
         </w:tc>
         <w:tc>
           <w:tcPr>
-            <w:tcW w:type="dxa" w:w="1247"/>
+            <w:tcW w:type="dxa" w:w="1474"/>
           </w:tcPr>
           <w:p>
             <w:r>
@@ -1221,7 +1556,7 @@
         </w:tc>
         <w:tc>
           <w:tcPr>
-            <w:tcW w:type="dxa" w:w="4309"/>
+            <w:tcW w:type="dxa" w:w="4082"/>
           </w:tcPr>
           <w:p>
             <w:r>
@@ -1275,7 +1610,7 @@
         </w:tc>
         <w:tc>
           <w:tcPr>
-            <w:tcW w:type="dxa" w:w="1247"/>
+            <w:tcW w:type="dxa" w:w="1474"/>
           </w:tcPr>
           <w:p>
             <w:r>
@@ -1288,7 +1623,7 @@
         </w:tc>
         <w:tc>
           <w:tcPr>
-            <w:tcW w:type="dxa" w:w="4309"/>
+            <w:tcW w:type="dxa" w:w="4082"/>
           </w:tcPr>
           <w:p>
             <w:r>
@@ -1342,7 +1677,7 @@
         </w:tc>
         <w:tc>
           <w:tcPr>
-            <w:tcW w:type="dxa" w:w="1247"/>
+            <w:tcW w:type="dxa" w:w="1474"/>
           </w:tcPr>
           <w:p>
             <w:r>
@@ -1355,7 +1690,7 @@
         </w:tc>
         <w:tc>
           <w:tcPr>
-            <w:tcW w:type="dxa" w:w="4309"/>
+            <w:tcW w:type="dxa" w:w="4082"/>
           </w:tcPr>
           <w:p>
             <w:r>
@@ -1447,7 +1782,7 @@
           <w:color w:val="1F3A8A"/>
           <w:sz w:val="25"/>
         </w:rPr>
-        <w:t>Módulo 2: Gestión de Productos (CRUD) — archivo pruebas/productos.test.js</w:t>
+        <w:t>Módulo 1: Autenticación (Login y Registro) — archivo pruebas/auth.test.js</w:t>
       </w:r>
     </w:p>
     <w:p>
@@ -1459,7 +1794,7 @@
           <w:b/>
           <w:sz w:val="24"/>
         </w:rPr>
-        <w:t>Caso 1: CP-PROD-001 — Caja negra</w:t>
+        <w:t>Caso 1: CP-LOGIN-001 — Caja negra</w:t>
       </w:r>
     </w:p>
     <w:tbl>
@@ -1523,7 +1858,7 @@
           </w:tcPr>
           <w:p>
             <w:r>
-              <w:t>CP-PROD-001</w:t>
+              <w:t>CP-LOGIN-001</w:t>
             </w:r>
           </w:p>
         </w:tc>
@@ -1568,7 +1903,7 @@
           </w:tcPr>
           <w:p>
             <w:r>
-              <w:t>Registro exitoso de un nuevo producto</w:t>
+              <w:t>Inicio de sesión exitoso con credenciales correctas</w:t>
             </w:r>
           </w:p>
         </w:tc>
@@ -1613,15 +1948,19 @@
           </w:tcPr>
           <w:p>
             <w:r>
-              <w:t>1. Iniciar sesión como administrador</w:t>
+              <w:t>1. Ir a la pantalla de login</w:t>
               <w:br/>
             </w:r>
             <w:r>
-              <w:t>2. Enviar POST /api/productos con los datos del producto</w:t>
+              <w:t>2. Ingresar correo válido</w:t>
               <w:br/>
             </w:r>
             <w:r>
-              <w:t>3. Buscar el producto por su código en el listado</w:t>
+              <w:t>3. Ingresar contraseña válida</w:t>
+              <w:br/>
+            </w:r>
+            <w:r>
+              <w:t>4. Presionar «Ingresar» (POST /api/auth/login)</w:t>
             </w:r>
           </w:p>
         </w:tc>
@@ -1666,7 +2005,7 @@
           </w:tcPr>
           <w:p>
             <w:r>
-              <w:t>Sesión activa con rol administrador; el código del producto no existe</w:t>
+              <w:t>El usuario está registrado y activo en la base de datos</w:t>
             </w:r>
           </w:p>
         </w:tc>
@@ -1711,7 +2050,11 @@
           </w:tcPr>
           <w:p>
             <w:r>
-              <w:t>código: ARZ-(único) · nombre: Arroz Integral 1 lb · precio de compra: Q6.00 · precio de venta: Q8.50 · stock: 40 · categoría: Granos Básicos</w:t>
+              <w:t>correo: admin@tienda.com</w:t>
+              <w:br/>
+            </w:r>
+            <w:r>
+              <w:t>contraseña: admin123  (usuario sembrado en la base de datos)</w:t>
             </w:r>
           </w:p>
         </w:tc>
@@ -1756,7 +2099,7 @@
           </w:tcPr>
           <w:p>
             <w:r>
-              <w:t>201 Created con el mensaje «Producto creado.»; el producto aparece en el listado con sus datos</w:t>
+              <w:t>200 OK; se crea la sesión con el rol del usuario y se muestra el panel principal (dashboard)</w:t>
             </w:r>
           </w:p>
         </w:tc>
@@ -1802,7 +2145,7 @@
           </w:tcPr>
           <w:p>
             <w:r>
-              <w:t>201 «Producto creado.»; el listado lo muestra con precio Q8.50 y stock 40</w:t>
+              <w:t>200 «Sesion iniciada correctamente.»; devuelve el usuario con rol admin</w:t>
             </w:r>
           </w:p>
         </w:tc>
@@ -1872,7 +2215,7 @@
           <w:b/>
           <w:sz w:val="24"/>
         </w:rPr>
-        <w:t>Caso 2: CP-PROD-002 — Caja negra</w:t>
+        <w:t>Caso 2: CP-LOGIN-002 — Caja negra</w:t>
       </w:r>
     </w:p>
     <w:tbl>
@@ -1936,7 +2279,7 @@
           </w:tcPr>
           <w:p>
             <w:r>
-              <w:t>CP-PROD-002</w:t>
+              <w:t>CP-LOGIN-002</w:t>
             </w:r>
           </w:p>
         </w:tc>
@@ -1981,7 +2324,7 @@
           </w:tcPr>
           <w:p>
             <w:r>
-              <w:t>Actualización del precio de un producto existente</w:t>
+              <w:t>Fallo por contraseña incorrecta</w:t>
             </w:r>
           </w:p>
         </w:tc>
@@ -2026,15 +2369,19 @@
           </w:tcPr>
           <w:p>
             <w:r>
-              <w:t>1. Crear un producto con precio de venta Q10.00</w:t>
+              <w:t>1. Ir a la pantalla de login</w:t>
               <w:br/>
             </w:r>
             <w:r>
-              <w:t>2. Enviar PUT /api/productos/{id} con el nuevo precio</w:t>
+              <w:t>2. Ingresar correo válido</w:t>
               <w:br/>
             </w:r>
             <w:r>
-              <w:t>3. Consultar el producto</w:t>
+              <w:t>3. Ingresar contraseña errónea</w:t>
+              <w:br/>
+            </w:r>
+            <w:r>
+              <w:t>4. Presionar «Ingresar» (POST /api/auth/login)</w:t>
             </w:r>
           </w:p>
         </w:tc>
@@ -2079,7 +2426,7 @@
           </w:tcPr>
           <w:p>
             <w:r>
-              <w:t>El producto existe en el catálogo; sesión de administrador</w:t>
+              <w:t>El usuario está registrado en el sistema</w:t>
             </w:r>
           </w:p>
         </w:tc>
@@ -2124,7 +2471,11 @@
           </w:tcPr>
           <w:p>
             <w:r>
-              <w:t>precio de venta anterior: Q10.00 · precio nuevo: Q12.50</w:t>
+              <w:t>correo: admin@tienda.com</w:t>
+              <w:br/>
+            </w:r>
+            <w:r>
+              <w:t>contraseña: clave_incorrecta123</w:t>
             </w:r>
           </w:p>
         </w:tc>
@@ -2169,7 +2520,7 @@
           </w:tcPr>
           <w:p>
             <w:r>
-              <w:t>200 OK; al consultar el producto su precio es Q12.50</w:t>
+              <w:t>401 Unauthorized con el mensaje «Credenciales inválidas»; no permite el acceso</w:t>
             </w:r>
           </w:p>
         </w:tc>
@@ -2215,7 +2566,7 @@
           </w:tcPr>
           <w:p>
             <w:r>
-              <w:t>200 «Producto actualizado.»; el detalle devuelve precio 12.5</w:t>
+              <w:t>401 «Credenciales invalidas.»; la pantalla muestra «Correo o contraseña incorrectos»</w:t>
             </w:r>
           </w:p>
         </w:tc>
@@ -2285,7 +2636,7 @@
           <w:b/>
           <w:sz w:val="24"/>
         </w:rPr>
-        <w:t>Caso 3: CP-PROD-003 — Caja negra</w:t>
+        <w:t>Caso 3: CP-LOGIN-003 — Caja negra</w:t>
       </w:r>
     </w:p>
     <w:tbl>
@@ -2349,7 +2700,7 @@
           </w:tcPr>
           <w:p>
             <w:r>
-              <w:t>CP-PROD-003</w:t>
+              <w:t>CP-LOGIN-003</w:t>
             </w:r>
           </w:p>
         </w:tc>
@@ -2394,7 +2745,7 @@
           </w:tcPr>
           <w:p>
             <w:r>
-              <w:t>Eliminación de un producto del catálogo</w:t>
+              <w:t>Validación de campos vacíos</w:t>
             </w:r>
           </w:p>
         </w:tc>
@@ -2439,109 +2790,109 @@
           </w:tcPr>
           <w:p>
             <w:r>
-              <w:t>1. Crear un producto</w:t>
+              <w:t>1. Ir a la pantalla de login</w:t>
               <w:br/>
             </w:r>
             <w:r>
-              <w:t>2. Enviar DELETE /api/productos/{id}</w:t>
+              <w:t>2. Dejar correo y contraseña en blanco</w:t>
               <w:br/>
             </w:r>
             <w:r>
-              <w:t>3. Buscarlo en el listado</w:t>
+              <w:t>3. Presionar «Ingresar» (POST /api/auth/login)</w:t>
+            </w:r>
+          </w:p>
+        </w:tc>
+      </w:tr>
+      <w:tr>
+        <w:tblPrEx>
+          <w:tblCellMar>
+            <w:top w:w="0" w:type="dxa"/>
+            <w:bottom w:w="0" w:type="dxa"/>
+          </w:tblCellMar>
+        </w:tblPrEx>
+        <w:tc>
+          <w:tcPr>
+            <w:tcW w:w="2400" w:type="dxa"/>
+            <w:shd w:val="clear" w:color="auto" w:fill="EDEDED"/>
+            <w:tcMar>
+              <w:top w:w="100" w:type="dxa"/>
+              <w:left w:w="120" w:type="dxa"/>
+              <w:bottom w:w="100" w:type="dxa"/>
+              <w:right w:w="120" w:type="dxa"/>
+            </w:tcMar>
+          </w:tcPr>
+          <w:p>
+            <w:r>
+              <w:rPr>
+                <w:b/>
+                <w:bCs/>
+              </w:rPr>
+              <w:t>Requisitos previos</w:t>
+            </w:r>
+          </w:p>
+        </w:tc>
+        <w:tc>
+          <w:tcPr>
+            <w:tcW w:w="6950" w:type="dxa"/>
+            <w:tcMar>
+              <w:top w:w="100" w:type="dxa"/>
+              <w:left w:w="120" w:type="dxa"/>
+              <w:bottom w:w="100" w:type="dxa"/>
+              <w:right w:w="120" w:type="dxa"/>
+            </w:tcMar>
+          </w:tcPr>
+          <w:p>
+            <w:r>
+              <w:t>Estar en la pantalla de login</w:t>
+            </w:r>
+          </w:p>
+        </w:tc>
+      </w:tr>
+      <w:tr>
+        <w:tblPrEx>
+          <w:tblCellMar>
+            <w:top w:w="0" w:type="dxa"/>
+            <w:bottom w:w="0" w:type="dxa"/>
+          </w:tblCellMar>
+        </w:tblPrEx>
+        <w:tc>
+          <w:tcPr>
+            <w:tcW w:w="2400" w:type="dxa"/>
+            <w:shd w:val="clear" w:color="auto" w:fill="EDEDED"/>
+            <w:tcMar>
+              <w:top w:w="100" w:type="dxa"/>
+              <w:left w:w="120" w:type="dxa"/>
+              <w:bottom w:w="100" w:type="dxa"/>
+              <w:right w:w="120" w:type="dxa"/>
+            </w:tcMar>
+          </w:tcPr>
+          <w:p>
+            <w:r>
+              <w:rPr>
+                <w:b/>
+                <w:bCs/>
+              </w:rPr>
+              <w:t>Datos de prueba</w:t>
+            </w:r>
+          </w:p>
+        </w:tc>
+        <w:tc>
+          <w:tcPr>
+            <w:tcW w:w="6950" w:type="dxa"/>
+            <w:tcMar>
+              <w:top w:w="100" w:type="dxa"/>
+              <w:left w:w="120" w:type="dxa"/>
+              <w:bottom w:w="100" w:type="dxa"/>
+              <w:right w:w="120" w:type="dxa"/>
+            </w:tcMar>
+          </w:tcPr>
+          <w:p>
+            <w:r>
+              <w:t>correo: (vacío)</w:t>
               <w:br/>
             </w:r>
             <w:r>
-              <w:t>4. Intentar venderlo</w:t>
-            </w:r>
-          </w:p>
-        </w:tc>
-      </w:tr>
-      <w:tr>
-        <w:tblPrEx>
-          <w:tblCellMar>
-            <w:top w:w="0" w:type="dxa"/>
-            <w:bottom w:w="0" w:type="dxa"/>
-          </w:tblCellMar>
-        </w:tblPrEx>
-        <w:tc>
-          <w:tcPr>
-            <w:tcW w:w="2400" w:type="dxa"/>
-            <w:shd w:val="clear" w:color="auto" w:fill="EDEDED"/>
-            <w:tcMar>
-              <w:top w:w="100" w:type="dxa"/>
-              <w:left w:w="120" w:type="dxa"/>
-              <w:bottom w:w="100" w:type="dxa"/>
-              <w:right w:w="120" w:type="dxa"/>
-            </w:tcMar>
-          </w:tcPr>
-          <w:p>
-            <w:r>
-              <w:rPr>
-                <w:b/>
-                <w:bCs/>
-              </w:rPr>
-              <w:t>Requisitos previos</w:t>
-            </w:r>
-          </w:p>
-        </w:tc>
-        <w:tc>
-          <w:tcPr>
-            <w:tcW w:w="6950" w:type="dxa"/>
-            <w:tcMar>
-              <w:top w:w="100" w:type="dxa"/>
-              <w:left w:w="120" w:type="dxa"/>
-              <w:bottom w:w="100" w:type="dxa"/>
-              <w:right w:w="120" w:type="dxa"/>
-            </w:tcMar>
-          </w:tcPr>
-          <w:p>
-            <w:r>
-              <w:t>El producto existe y está activo</w:t>
-            </w:r>
-          </w:p>
-        </w:tc>
-      </w:tr>
-      <w:tr>
-        <w:tblPrEx>
-          <w:tblCellMar>
-            <w:top w:w="0" w:type="dxa"/>
-            <w:bottom w:w="0" w:type="dxa"/>
-          </w:tblCellMar>
-        </w:tblPrEx>
-        <w:tc>
-          <w:tcPr>
-            <w:tcW w:w="2400" w:type="dxa"/>
-            <w:shd w:val="clear" w:color="auto" w:fill="EDEDED"/>
-            <w:tcMar>
-              <w:top w:w="100" w:type="dxa"/>
-              <w:left w:w="120" w:type="dxa"/>
-              <w:bottom w:w="100" w:type="dxa"/>
-              <w:right w:w="120" w:type="dxa"/>
-            </w:tcMar>
-          </w:tcPr>
-          <w:p>
-            <w:r>
-              <w:rPr>
-                <w:b/>
-                <w:bCs/>
-              </w:rPr>
-              <w:t>Datos de prueba</w:t>
-            </w:r>
-          </w:p>
-        </w:tc>
-        <w:tc>
-          <w:tcPr>
-            <w:tcW w:w="6950" w:type="dxa"/>
-            <w:tcMar>
-              <w:top w:w="100" w:type="dxa"/>
-              <w:left w:w="120" w:type="dxa"/>
-              <w:bottom w:w="100" w:type="dxa"/>
-              <w:right w:w="120" w:type="dxa"/>
-            </w:tcMar>
-          </w:tcPr>
-          <w:p>
-            <w:r>
-              <w:t>código: ELI-(único)</w:t>
+              <w:t>contraseña: (vacío)</w:t>
             </w:r>
           </w:p>
         </w:tc>
@@ -2586,7 +2937,7 @@
           </w:tcPr>
           <w:p>
             <w:r>
-              <w:t>200 OK; el producto ya no aparece en el listado y no se puede vender</w:t>
+              <w:t>422 con el mensaje de validación «Correo y contrasena son obligatorios.»</w:t>
             </w:r>
           </w:p>
         </w:tc>
@@ -2632,7 +2983,7 @@
           </w:tcPr>
           <w:p>
             <w:r>
-              <w:t>200 «Producto eliminado (baja logica).»; listado vacío; la venta responde 422 «Producto … no existe»</w:t>
+              <w:t>422 «Correo y contrasena son obligatorios.»</w:t>
             </w:r>
           </w:p>
         </w:tc>
@@ -2702,7 +3053,7 @@
           <w:b/>
           <w:sz w:val="24"/>
         </w:rPr>
-        <w:t>Caso 4: CP-PROD-004 — Caja blanca</w:t>
+        <w:t>Caso 4: CP-REG-001 — Caja negra</w:t>
       </w:r>
     </w:p>
     <w:tbl>
@@ -2766,7 +3117,7 @@
           </w:tcPr>
           <w:p>
             <w:r>
-              <w:t>CP-PROD-004</w:t>
+              <w:t>CP-REG-001</w:t>
             </w:r>
           </w:p>
         </w:tc>
@@ -2811,7 +3162,7 @@
           </w:tcPr>
           <w:p>
             <w:r>
-              <w:t>Intento de registrar un producto con campos obligatorios vacíos o inválidos</w:t>
+              <w:t>Registro exitoso de un nuevo usuario</w:t>
             </w:r>
           </w:p>
         </w:tc>
@@ -2856,15 +3207,15 @@
           </w:tcPr>
           <w:p>
             <w:r>
-              <w:t>1. Leer api_productos_create() en app/controllers/productos.php e identificar sus 4 ramas de rechazo</w:t>
+              <w:t>1. Ir a la pantalla de registro</w:t>
               <w:br/>
             </w:r>
             <w:r>
-              <w:t>2. Enviar un POST por cada rama</w:t>
+              <w:t>2. Llenar nombre, correo y contraseña</w:t>
               <w:br/>
             </w:r>
             <w:r>
-              <w:t>3. Verificar el código, el mensaje y que no se guardó nada</w:t>
+              <w:t>3. Presionar «Crear cuenta» (POST /api/auth/register)</w:t>
             </w:r>
           </w:p>
         </w:tc>
@@ -2909,7 +3260,7 @@
           </w:tcPr>
           <w:p>
             <w:r>
-              <w:t>Sesión de administrador; formulario/endpoint de nuevo producto</w:t>
+              <w:t>El correo a registrar no existe aún en la base de datos</w:t>
             </w:r>
           </w:p>
         </w:tc>
@@ -2954,19 +3305,15 @@
           </w:tcPr>
           <w:p>
             <w:r>
-              <w:t>Rama 1: código vacío / nombre con solo espacios</w:t>
+              <w:t>nombre: Cajero Nuevo</w:t>
               <w:br/>
             </w:r>
             <w:r>
-              <w:t>Rama 2: sin precio de compra / precio de venta vacío</w:t>
+              <w:t>correo: cajero_nuevo_(único por corrida)@tienda.com</w:t>
               <w:br/>
             </w:r>
             <w:r>
-              <w:t>Rama 3: precio de compra −1 / precio de venta «diez»</w:t>
-              <w:br/>
-            </w:r>
-            <w:r>
-              <w:t>Rama 4: código ya registrado</w:t>
+              <w:t>contraseña: cajero123</w:t>
             </w:r>
           </w:p>
         </w:tc>
@@ -3011,11 +3358,7 @@
           </w:tcPr>
           <w:p>
             <w:r>
-              <w:t>Ramas 1–3: 422 con el mensaje de validación de cada rama, sin guardar el producto</w:t>
-              <w:br/>
-            </w:r>
-            <w:r>
-              <w:t>Rama 4: 409 «Ya existe un producto con ese codigo»</w:t>
+              <w:t>201 Created con el mensaje «Usuario registrado correctamente.»; el usuario queda guardado con rol cajero</w:t>
             </w:r>
           </w:p>
         </w:tc>
@@ -3061,23 +3404,7 @@
           </w:tcPr>
           <w:p>
             <w:r>
-              <w:t>Rama 1: 422 «Codigo y nombre son obligatorios.»</w:t>
-              <w:br/>
-            </w:r>
-            <w:r>
-              <w:t>Rama 2: 422 «El precio de compra y el precio de venta son obligatorios.»</w:t>
-              <w:br/>
-            </w:r>
-            <w:r>
-              <w:t>Rama 3: 422 «El precio de … debe ser un numero mayor o igual a 0.»</w:t>
-              <w:br/>
-            </w:r>
-            <w:r>
-              <w:t>Rama 4: 409 «Ya existe un producto con ese codigo.»</w:t>
-              <w:br/>
-            </w:r>
-            <w:r>
-              <w:t>En ningún caso quedó guardado (7 de 7 verificaciones)</w:t>
+              <w:t>201 «Usuario registrado correctamente.»; devuelve el id del nuevo usuario</w:t>
             </w:r>
           </w:p>
         </w:tc>
@@ -3147,7 +3474,2133 @@
           <w:b/>
           <w:sz w:val="24"/>
         </w:rPr>
-        <w:t>Caso 5: CP-PROD-005 — Caja gris</w:t>
+        <w:t>Caso 5: CP-REG-002 — Caja negra</w:t>
+      </w:r>
+    </w:p>
+    <w:tbl>
+      <w:tblPr>
+        <w:tblW w:w="9350" w:type="dxa"/>
+        <w:tblBorders>
+          <w:top w:val="single" w:sz="4" w:space="0" w:color="auto"/>
+          <w:left w:val="single" w:sz="4" w:space="0" w:color="auto"/>
+          <w:bottom w:val="single" w:sz="4" w:space="0" w:color="auto"/>
+          <w:right w:val="single" w:sz="4" w:space="0" w:color="auto"/>
+          <w:insideH w:val="single" w:sz="4" w:space="0" w:color="auto"/>
+          <w:insideV w:val="single" w:sz="4" w:space="0" w:color="auto"/>
+        </w:tblBorders>
+        <w:tblCellMar>
+          <w:left w:w="10" w:type="dxa"/>
+          <w:right w:w="10" w:type="dxa"/>
+        </w:tblCellMar>
+        <w:tblLook w:val="04A0" w:firstRow="1" w:lastRow="0" w:firstColumn="1" w:lastColumn="0" w:noHBand="0" w:noVBand="1"/>
+      </w:tblPr>
+      <w:tblGrid>
+        <w:gridCol w:w="2400"/>
+        <w:gridCol w:w="6950"/>
+      </w:tblGrid>
+      <w:tr>
+        <w:tblPrEx>
+          <w:tblCellMar>
+            <w:top w:w="0" w:type="dxa"/>
+            <w:bottom w:w="0" w:type="dxa"/>
+          </w:tblCellMar>
+        </w:tblPrEx>
+        <w:tc>
+          <w:tcPr>
+            <w:tcW w:w="2400" w:type="dxa"/>
+            <w:shd w:val="clear" w:color="auto" w:fill="EDEDED"/>
+            <w:tcMar>
+              <w:top w:w="100" w:type="dxa"/>
+              <w:left w:w="120" w:type="dxa"/>
+              <w:bottom w:w="100" w:type="dxa"/>
+              <w:right w:w="120" w:type="dxa"/>
+            </w:tcMar>
+          </w:tcPr>
+          <w:p>
+            <w:r>
+              <w:rPr>
+                <w:b/>
+                <w:bCs/>
+              </w:rPr>
+              <w:t>ID del caso de prueba</w:t>
+            </w:r>
+          </w:p>
+        </w:tc>
+        <w:tc>
+          <w:tcPr>
+            <w:tcW w:w="6950" w:type="dxa"/>
+            <w:tcMar>
+              <w:top w:w="100" w:type="dxa"/>
+              <w:left w:w="120" w:type="dxa"/>
+              <w:bottom w:w="100" w:type="dxa"/>
+              <w:right w:w="120" w:type="dxa"/>
+            </w:tcMar>
+          </w:tcPr>
+          <w:p>
+            <w:r>
+              <w:t>CP-REG-002</w:t>
+            </w:r>
+          </w:p>
+        </w:tc>
+      </w:tr>
+      <w:tr>
+        <w:tblPrEx>
+          <w:tblCellMar>
+            <w:top w:w="0" w:type="dxa"/>
+            <w:bottom w:w="0" w:type="dxa"/>
+          </w:tblCellMar>
+        </w:tblPrEx>
+        <w:tc>
+          <w:tcPr>
+            <w:tcW w:w="2400" w:type="dxa"/>
+            <w:shd w:val="clear" w:color="auto" w:fill="EDEDED"/>
+            <w:tcMar>
+              <w:top w:w="100" w:type="dxa"/>
+              <w:left w:w="120" w:type="dxa"/>
+              <w:bottom w:w="100" w:type="dxa"/>
+              <w:right w:w="120" w:type="dxa"/>
+            </w:tcMar>
+          </w:tcPr>
+          <w:p>
+            <w:r>
+              <w:rPr>
+                <w:b/>
+                <w:bCs/>
+              </w:rPr>
+              <w:t>Escenario de prueba</w:t>
+            </w:r>
+          </w:p>
+        </w:tc>
+        <w:tc>
+          <w:tcPr>
+            <w:tcW w:w="6950" w:type="dxa"/>
+            <w:tcMar>
+              <w:top w:w="100" w:type="dxa"/>
+              <w:left w:w="120" w:type="dxa"/>
+              <w:bottom w:w="100" w:type="dxa"/>
+              <w:right w:w="120" w:type="dxa"/>
+            </w:tcMar>
+          </w:tcPr>
+          <w:p>
+            <w:r>
+              <w:t>Rechazo por correo ya registrado</w:t>
+            </w:r>
+          </w:p>
+        </w:tc>
+      </w:tr>
+      <w:tr>
+        <w:tblPrEx>
+          <w:tblCellMar>
+            <w:top w:w="0" w:type="dxa"/>
+            <w:bottom w:w="0" w:type="dxa"/>
+          </w:tblCellMar>
+        </w:tblPrEx>
+        <w:tc>
+          <w:tcPr>
+            <w:tcW w:w="2400" w:type="dxa"/>
+            <w:shd w:val="clear" w:color="auto" w:fill="EDEDED"/>
+            <w:tcMar>
+              <w:top w:w="100" w:type="dxa"/>
+              <w:left w:w="120" w:type="dxa"/>
+              <w:bottom w:w="100" w:type="dxa"/>
+              <w:right w:w="120" w:type="dxa"/>
+            </w:tcMar>
+          </w:tcPr>
+          <w:p>
+            <w:r>
+              <w:rPr>
+                <w:b/>
+                <w:bCs/>
+              </w:rPr>
+              <w:t>Pasos de la prueba</w:t>
+            </w:r>
+          </w:p>
+        </w:tc>
+        <w:tc>
+          <w:tcPr>
+            <w:tcW w:w="6950" w:type="dxa"/>
+            <w:tcMar>
+              <w:top w:w="100" w:type="dxa"/>
+              <w:left w:w="120" w:type="dxa"/>
+              <w:bottom w:w="100" w:type="dxa"/>
+              <w:right w:w="120" w:type="dxa"/>
+            </w:tcMar>
+          </w:tcPr>
+          <w:p>
+            <w:r>
+              <w:t>1. Ir a la pantalla de registro</w:t>
+              <w:br/>
+            </w:r>
+            <w:r>
+              <w:t>2. Ingresar un correo ya existente</w:t>
+              <w:br/>
+            </w:r>
+            <w:r>
+              <w:t>3. Completar el resto del formulario</w:t>
+              <w:br/>
+            </w:r>
+            <w:r>
+              <w:t>4. Presionar «Crear cuenta» (POST /api/auth/register)</w:t>
+            </w:r>
+          </w:p>
+        </w:tc>
+      </w:tr>
+      <w:tr>
+        <w:tblPrEx>
+          <w:tblCellMar>
+            <w:top w:w="0" w:type="dxa"/>
+            <w:bottom w:w="0" w:type="dxa"/>
+          </w:tblCellMar>
+        </w:tblPrEx>
+        <w:tc>
+          <w:tcPr>
+            <w:tcW w:w="2400" w:type="dxa"/>
+            <w:shd w:val="clear" w:color="auto" w:fill="EDEDED"/>
+            <w:tcMar>
+              <w:top w:w="100" w:type="dxa"/>
+              <w:left w:w="120" w:type="dxa"/>
+              <w:bottom w:w="100" w:type="dxa"/>
+              <w:right w:w="120" w:type="dxa"/>
+            </w:tcMar>
+          </w:tcPr>
+          <w:p>
+            <w:r>
+              <w:rPr>
+                <w:b/>
+                <w:bCs/>
+              </w:rPr>
+              <w:t>Requisitos previos</w:t>
+            </w:r>
+          </w:p>
+        </w:tc>
+        <w:tc>
+          <w:tcPr>
+            <w:tcW w:w="6950" w:type="dxa"/>
+            <w:tcMar>
+              <w:top w:w="100" w:type="dxa"/>
+              <w:left w:w="120" w:type="dxa"/>
+              <w:bottom w:w="100" w:type="dxa"/>
+              <w:right w:w="120" w:type="dxa"/>
+            </w:tcMar>
+          </w:tcPr>
+          <w:p>
+            <w:r>
+              <w:t>El correo ingresado ya existe en la base de datos</w:t>
+            </w:r>
+          </w:p>
+        </w:tc>
+      </w:tr>
+      <w:tr>
+        <w:tblPrEx>
+          <w:tblCellMar>
+            <w:top w:w="0" w:type="dxa"/>
+            <w:bottom w:w="0" w:type="dxa"/>
+          </w:tblCellMar>
+        </w:tblPrEx>
+        <w:tc>
+          <w:tcPr>
+            <w:tcW w:w="2400" w:type="dxa"/>
+            <w:shd w:val="clear" w:color="auto" w:fill="EDEDED"/>
+            <w:tcMar>
+              <w:top w:w="100" w:type="dxa"/>
+              <w:left w:w="120" w:type="dxa"/>
+              <w:bottom w:w="100" w:type="dxa"/>
+              <w:right w:w="120" w:type="dxa"/>
+            </w:tcMar>
+          </w:tcPr>
+          <w:p>
+            <w:r>
+              <w:rPr>
+                <w:b/>
+                <w:bCs/>
+              </w:rPr>
+              <w:t>Datos de prueba</w:t>
+            </w:r>
+          </w:p>
+        </w:tc>
+        <w:tc>
+          <w:tcPr>
+            <w:tcW w:w="6950" w:type="dxa"/>
+            <w:tcMar>
+              <w:top w:w="100" w:type="dxa"/>
+              <w:left w:w="120" w:type="dxa"/>
+              <w:bottom w:w="100" w:type="dxa"/>
+              <w:right w:w="120" w:type="dxa"/>
+            </w:tcMar>
+          </w:tcPr>
+          <w:p>
+            <w:r>
+              <w:t>nombre: Usuario Prueba 2</w:t>
+              <w:br/>
+            </w:r>
+            <w:r>
+              <w:t>correo: admin@tienda.com  (ya registrado)</w:t>
+              <w:br/>
+            </w:r>
+            <w:r>
+              <w:t>contraseña: cajero123</w:t>
+            </w:r>
+          </w:p>
+        </w:tc>
+      </w:tr>
+      <w:tr>
+        <w:tblPrEx>
+          <w:tblCellMar>
+            <w:top w:w="0" w:type="dxa"/>
+            <w:bottom w:w="0" w:type="dxa"/>
+          </w:tblCellMar>
+        </w:tblPrEx>
+        <w:tc>
+          <w:tcPr>
+            <w:tcW w:w="2400" w:type="dxa"/>
+            <w:shd w:val="clear" w:color="auto" w:fill="EDEDED"/>
+            <w:tcMar>
+              <w:top w:w="100" w:type="dxa"/>
+              <w:left w:w="120" w:type="dxa"/>
+              <w:bottom w:w="100" w:type="dxa"/>
+              <w:right w:w="120" w:type="dxa"/>
+            </w:tcMar>
+          </w:tcPr>
+          <w:p>
+            <w:r>
+              <w:rPr>
+                <w:b/>
+                <w:bCs/>
+              </w:rPr>
+              <w:t>Resultado esperado / previsto</w:t>
+            </w:r>
+          </w:p>
+        </w:tc>
+        <w:tc>
+          <w:tcPr>
+            <w:tcW w:w="6950" w:type="dxa"/>
+            <w:tcMar>
+              <w:top w:w="100" w:type="dxa"/>
+              <w:left w:w="120" w:type="dxa"/>
+              <w:bottom w:w="100" w:type="dxa"/>
+              <w:right w:w="120" w:type="dxa"/>
+            </w:tcMar>
+          </w:tcPr>
+          <w:p>
+            <w:r>
+              <w:t>409 con el mensaje «Ya existe un usuario con ese correo.»; no se crea el usuario</w:t>
+            </w:r>
+          </w:p>
+        </w:tc>
+      </w:tr>
+      <w:tr>
+        <w:tblPrEx>
+          <w:tblCellMar>
+            <w:top w:w="0" w:type="dxa"/>
+            <w:bottom w:w="0" w:type="dxa"/>
+          </w:tblCellMar>
+        </w:tblPrEx>
+        <w:tc>
+          <w:tcPr>
+            <w:tcW w:w="2400" w:type="dxa"/>
+            <w:shd w:val="clear" w:color="auto" w:fill="EDEDED"/>
+            <w:tcMar>
+              <w:top w:w="100" w:type="dxa"/>
+              <w:left w:w="120" w:type="dxa"/>
+              <w:bottom w:w="100" w:type="dxa"/>
+              <w:right w:w="120" w:type="dxa"/>
+            </w:tcMar>
+          </w:tcPr>
+          <w:p>
+            <w:r>
+              <w:rPr>
+                <w:b/>
+                <w:bCs/>
+              </w:rPr>
+              <w:t>Resultado real</w:t>
+            </w:r>
+          </w:p>
+        </w:tc>
+        <w:tc>
+          <w:tcPr>
+            <w:tcW w:w="6950" w:type="dxa"/>
+            <w:shd w:val="clear" w:color="auto" w:fill="FFF7E0"/>
+            <w:tcMar>
+              <w:top w:w="100" w:type="dxa"/>
+              <w:left w:w="120" w:type="dxa"/>
+              <w:bottom w:w="100" w:type="dxa"/>
+              <w:right w:w="120" w:type="dxa"/>
+            </w:tcMar>
+          </w:tcPr>
+          <w:p>
+            <w:r>
+              <w:t>409 «Ya existe un usuario con ese correo.»</w:t>
+            </w:r>
+          </w:p>
+        </w:tc>
+      </w:tr>
+      <w:tr>
+        <w:tblPrEx>
+          <w:tblCellMar>
+            <w:top w:w="0" w:type="dxa"/>
+            <w:bottom w:w="0" w:type="dxa"/>
+          </w:tblCellMar>
+        </w:tblPrEx>
+        <w:tc>
+          <w:tcPr>
+            <w:tcW w:w="2400" w:type="dxa"/>
+            <w:shd w:val="clear" w:color="auto" w:fill="EDEDED"/>
+            <w:tcMar>
+              <w:top w:w="100" w:type="dxa"/>
+              <w:left w:w="120" w:type="dxa"/>
+              <w:bottom w:w="100" w:type="dxa"/>
+              <w:right w:w="120" w:type="dxa"/>
+            </w:tcMar>
+          </w:tcPr>
+          <w:p>
+            <w:r>
+              <w:rPr>
+                <w:b/>
+                <w:bCs/>
+              </w:rPr>
+              <w:t>Estado de la prueba</w:t>
+            </w:r>
+          </w:p>
+        </w:tc>
+        <w:tc>
+          <w:tcPr>
+            <w:tcW w:w="6950" w:type="dxa"/>
+            <w:shd w:val="clear" w:color="auto" w:fill="FFF7E0"/>
+            <w:tcMar>
+              <w:top w:w="100" w:type="dxa"/>
+              <w:left w:w="120" w:type="dxa"/>
+              <w:bottom w:w="100" w:type="dxa"/>
+              <w:right w:w="120" w:type="dxa"/>
+            </w:tcMar>
+          </w:tcPr>
+          <w:p>
+            <w:r>
+              <w:rPr>
+                <w:b/>
+                <w:color w:val="047857"/>
+              </w:rPr>
+              <w:t>Aprobado</w:t>
+            </w:r>
+          </w:p>
+        </w:tc>
+      </w:tr>
+    </w:tbl>
+    <w:p>
+      <w:pPr>
+        <w:spacing w:after="80"/>
+      </w:pPr>
+    </w:p>
+    <w:p>
+      <w:pPr>
+        <w:spacing w:before="200" w:after="120"/>
+      </w:pPr>
+      <w:r>
+        <w:rPr>
+          <w:b/>
+          <w:color w:val="1F3A8A"/>
+          <w:sz w:val="25"/>
+        </w:rPr>
+        <w:t>Módulo 2: Gestión de Productos (CRUD) — archivo pruebas/productos.test.js</w:t>
+      </w:r>
+    </w:p>
+    <w:p>
+      <w:pPr>
+        <w:spacing w:before="0" w:after="120"/>
+      </w:pPr>
+      <w:r>
+        <w:rPr>
+          <w:b/>
+          <w:sz w:val="24"/>
+        </w:rPr>
+        <w:t>Caso 6: CP-PROD-001 — Caja negra</w:t>
+      </w:r>
+    </w:p>
+    <w:tbl>
+      <w:tblPr>
+        <w:tblW w:w="9350" w:type="dxa"/>
+        <w:tblBorders>
+          <w:top w:val="single" w:sz="4" w:space="0" w:color="auto"/>
+          <w:left w:val="single" w:sz="4" w:space="0" w:color="auto"/>
+          <w:bottom w:val="single" w:sz="4" w:space="0" w:color="auto"/>
+          <w:right w:val="single" w:sz="4" w:space="0" w:color="auto"/>
+          <w:insideH w:val="single" w:sz="4" w:space="0" w:color="auto"/>
+          <w:insideV w:val="single" w:sz="4" w:space="0" w:color="auto"/>
+        </w:tblBorders>
+        <w:tblCellMar>
+          <w:left w:w="10" w:type="dxa"/>
+          <w:right w:w="10" w:type="dxa"/>
+        </w:tblCellMar>
+        <w:tblLook w:val="04A0" w:firstRow="1" w:lastRow="0" w:firstColumn="1" w:lastColumn="0" w:noHBand="0" w:noVBand="1"/>
+      </w:tblPr>
+      <w:tblGrid>
+        <w:gridCol w:w="2400"/>
+        <w:gridCol w:w="6950"/>
+      </w:tblGrid>
+      <w:tr>
+        <w:tblPrEx>
+          <w:tblCellMar>
+            <w:top w:w="0" w:type="dxa"/>
+            <w:bottom w:w="0" w:type="dxa"/>
+          </w:tblCellMar>
+        </w:tblPrEx>
+        <w:tc>
+          <w:tcPr>
+            <w:tcW w:w="2400" w:type="dxa"/>
+            <w:shd w:val="clear" w:color="auto" w:fill="EDEDED"/>
+            <w:tcMar>
+              <w:top w:w="100" w:type="dxa"/>
+              <w:left w:w="120" w:type="dxa"/>
+              <w:bottom w:w="100" w:type="dxa"/>
+              <w:right w:w="120" w:type="dxa"/>
+            </w:tcMar>
+          </w:tcPr>
+          <w:p>
+            <w:r>
+              <w:rPr>
+                <w:b/>
+                <w:bCs/>
+              </w:rPr>
+              <w:t>ID del caso de prueba</w:t>
+            </w:r>
+          </w:p>
+        </w:tc>
+        <w:tc>
+          <w:tcPr>
+            <w:tcW w:w="6950" w:type="dxa"/>
+            <w:tcMar>
+              <w:top w:w="100" w:type="dxa"/>
+              <w:left w:w="120" w:type="dxa"/>
+              <w:bottom w:w="100" w:type="dxa"/>
+              <w:right w:w="120" w:type="dxa"/>
+            </w:tcMar>
+          </w:tcPr>
+          <w:p>
+            <w:r>
+              <w:t>CP-PROD-001</w:t>
+            </w:r>
+          </w:p>
+        </w:tc>
+      </w:tr>
+      <w:tr>
+        <w:tblPrEx>
+          <w:tblCellMar>
+            <w:top w:w="0" w:type="dxa"/>
+            <w:bottom w:w="0" w:type="dxa"/>
+          </w:tblCellMar>
+        </w:tblPrEx>
+        <w:tc>
+          <w:tcPr>
+            <w:tcW w:w="2400" w:type="dxa"/>
+            <w:shd w:val="clear" w:color="auto" w:fill="EDEDED"/>
+            <w:tcMar>
+              <w:top w:w="100" w:type="dxa"/>
+              <w:left w:w="120" w:type="dxa"/>
+              <w:bottom w:w="100" w:type="dxa"/>
+              <w:right w:w="120" w:type="dxa"/>
+            </w:tcMar>
+          </w:tcPr>
+          <w:p>
+            <w:r>
+              <w:rPr>
+                <w:b/>
+                <w:bCs/>
+              </w:rPr>
+              <w:t>Escenario de prueba</w:t>
+            </w:r>
+          </w:p>
+        </w:tc>
+        <w:tc>
+          <w:tcPr>
+            <w:tcW w:w="6950" w:type="dxa"/>
+            <w:tcMar>
+              <w:top w:w="100" w:type="dxa"/>
+              <w:left w:w="120" w:type="dxa"/>
+              <w:bottom w:w="100" w:type="dxa"/>
+              <w:right w:w="120" w:type="dxa"/>
+            </w:tcMar>
+          </w:tcPr>
+          <w:p>
+            <w:r>
+              <w:t>Registro exitoso de un nuevo producto</w:t>
+            </w:r>
+          </w:p>
+        </w:tc>
+      </w:tr>
+      <w:tr>
+        <w:tblPrEx>
+          <w:tblCellMar>
+            <w:top w:w="0" w:type="dxa"/>
+            <w:bottom w:w="0" w:type="dxa"/>
+          </w:tblCellMar>
+        </w:tblPrEx>
+        <w:tc>
+          <w:tcPr>
+            <w:tcW w:w="2400" w:type="dxa"/>
+            <w:shd w:val="clear" w:color="auto" w:fill="EDEDED"/>
+            <w:tcMar>
+              <w:top w:w="100" w:type="dxa"/>
+              <w:left w:w="120" w:type="dxa"/>
+              <w:bottom w:w="100" w:type="dxa"/>
+              <w:right w:w="120" w:type="dxa"/>
+            </w:tcMar>
+          </w:tcPr>
+          <w:p>
+            <w:r>
+              <w:rPr>
+                <w:b/>
+                <w:bCs/>
+              </w:rPr>
+              <w:t>Pasos de la prueba</w:t>
+            </w:r>
+          </w:p>
+        </w:tc>
+        <w:tc>
+          <w:tcPr>
+            <w:tcW w:w="6950" w:type="dxa"/>
+            <w:tcMar>
+              <w:top w:w="100" w:type="dxa"/>
+              <w:left w:w="120" w:type="dxa"/>
+              <w:bottom w:w="100" w:type="dxa"/>
+              <w:right w:w="120" w:type="dxa"/>
+            </w:tcMar>
+          </w:tcPr>
+          <w:p>
+            <w:r>
+              <w:t>1. Iniciar sesión como administrador</w:t>
+              <w:br/>
+            </w:r>
+            <w:r>
+              <w:t>2. Enviar POST /api/productos con los datos del producto</w:t>
+              <w:br/>
+            </w:r>
+            <w:r>
+              <w:t>3. Buscar el producto por su código en el listado</w:t>
+            </w:r>
+          </w:p>
+        </w:tc>
+      </w:tr>
+      <w:tr>
+        <w:tblPrEx>
+          <w:tblCellMar>
+            <w:top w:w="0" w:type="dxa"/>
+            <w:bottom w:w="0" w:type="dxa"/>
+          </w:tblCellMar>
+        </w:tblPrEx>
+        <w:tc>
+          <w:tcPr>
+            <w:tcW w:w="2400" w:type="dxa"/>
+            <w:shd w:val="clear" w:color="auto" w:fill="EDEDED"/>
+            <w:tcMar>
+              <w:top w:w="100" w:type="dxa"/>
+              <w:left w:w="120" w:type="dxa"/>
+              <w:bottom w:w="100" w:type="dxa"/>
+              <w:right w:w="120" w:type="dxa"/>
+            </w:tcMar>
+          </w:tcPr>
+          <w:p>
+            <w:r>
+              <w:rPr>
+                <w:b/>
+                <w:bCs/>
+              </w:rPr>
+              <w:t>Requisitos previos</w:t>
+            </w:r>
+          </w:p>
+        </w:tc>
+        <w:tc>
+          <w:tcPr>
+            <w:tcW w:w="6950" w:type="dxa"/>
+            <w:tcMar>
+              <w:top w:w="100" w:type="dxa"/>
+              <w:left w:w="120" w:type="dxa"/>
+              <w:bottom w:w="100" w:type="dxa"/>
+              <w:right w:w="120" w:type="dxa"/>
+            </w:tcMar>
+          </w:tcPr>
+          <w:p>
+            <w:r>
+              <w:t>Sesión activa con rol administrador; el código del producto no existe</w:t>
+            </w:r>
+          </w:p>
+        </w:tc>
+      </w:tr>
+      <w:tr>
+        <w:tblPrEx>
+          <w:tblCellMar>
+            <w:top w:w="0" w:type="dxa"/>
+            <w:bottom w:w="0" w:type="dxa"/>
+          </w:tblCellMar>
+        </w:tblPrEx>
+        <w:tc>
+          <w:tcPr>
+            <w:tcW w:w="2400" w:type="dxa"/>
+            <w:shd w:val="clear" w:color="auto" w:fill="EDEDED"/>
+            <w:tcMar>
+              <w:top w:w="100" w:type="dxa"/>
+              <w:left w:w="120" w:type="dxa"/>
+              <w:bottom w:w="100" w:type="dxa"/>
+              <w:right w:w="120" w:type="dxa"/>
+            </w:tcMar>
+          </w:tcPr>
+          <w:p>
+            <w:r>
+              <w:rPr>
+                <w:b/>
+                <w:bCs/>
+              </w:rPr>
+              <w:t>Datos de prueba</w:t>
+            </w:r>
+          </w:p>
+        </w:tc>
+        <w:tc>
+          <w:tcPr>
+            <w:tcW w:w="6950" w:type="dxa"/>
+            <w:tcMar>
+              <w:top w:w="100" w:type="dxa"/>
+              <w:left w:w="120" w:type="dxa"/>
+              <w:bottom w:w="100" w:type="dxa"/>
+              <w:right w:w="120" w:type="dxa"/>
+            </w:tcMar>
+          </w:tcPr>
+          <w:p>
+            <w:r>
+              <w:t>código: ARZ-(único) · nombre: Arroz Integral 1 lb · precio de compra: Q6.00 · precio de venta: Q8.50 · stock: 40 · categoría: Granos Básicos</w:t>
+            </w:r>
+          </w:p>
+        </w:tc>
+      </w:tr>
+      <w:tr>
+        <w:tblPrEx>
+          <w:tblCellMar>
+            <w:top w:w="0" w:type="dxa"/>
+            <w:bottom w:w="0" w:type="dxa"/>
+          </w:tblCellMar>
+        </w:tblPrEx>
+        <w:tc>
+          <w:tcPr>
+            <w:tcW w:w="2400" w:type="dxa"/>
+            <w:shd w:val="clear" w:color="auto" w:fill="EDEDED"/>
+            <w:tcMar>
+              <w:top w:w="100" w:type="dxa"/>
+              <w:left w:w="120" w:type="dxa"/>
+              <w:bottom w:w="100" w:type="dxa"/>
+              <w:right w:w="120" w:type="dxa"/>
+            </w:tcMar>
+          </w:tcPr>
+          <w:p>
+            <w:r>
+              <w:rPr>
+                <w:b/>
+                <w:bCs/>
+              </w:rPr>
+              <w:t>Resultado esperado / previsto</w:t>
+            </w:r>
+          </w:p>
+        </w:tc>
+        <w:tc>
+          <w:tcPr>
+            <w:tcW w:w="6950" w:type="dxa"/>
+            <w:tcMar>
+              <w:top w:w="100" w:type="dxa"/>
+              <w:left w:w="120" w:type="dxa"/>
+              <w:bottom w:w="100" w:type="dxa"/>
+              <w:right w:w="120" w:type="dxa"/>
+            </w:tcMar>
+          </w:tcPr>
+          <w:p>
+            <w:r>
+              <w:t>201 Created con el mensaje «Producto creado.»; el producto aparece en el listado con sus datos</w:t>
+            </w:r>
+          </w:p>
+        </w:tc>
+      </w:tr>
+      <w:tr>
+        <w:tblPrEx>
+          <w:tblCellMar>
+            <w:top w:w="0" w:type="dxa"/>
+            <w:bottom w:w="0" w:type="dxa"/>
+          </w:tblCellMar>
+        </w:tblPrEx>
+        <w:tc>
+          <w:tcPr>
+            <w:tcW w:w="2400" w:type="dxa"/>
+            <w:shd w:val="clear" w:color="auto" w:fill="EDEDED"/>
+            <w:tcMar>
+              <w:top w:w="100" w:type="dxa"/>
+              <w:left w:w="120" w:type="dxa"/>
+              <w:bottom w:w="100" w:type="dxa"/>
+              <w:right w:w="120" w:type="dxa"/>
+            </w:tcMar>
+          </w:tcPr>
+          <w:p>
+            <w:r>
+              <w:rPr>
+                <w:b/>
+                <w:bCs/>
+              </w:rPr>
+              <w:t>Resultado real</w:t>
+            </w:r>
+          </w:p>
+        </w:tc>
+        <w:tc>
+          <w:tcPr>
+            <w:tcW w:w="6950" w:type="dxa"/>
+            <w:shd w:val="clear" w:color="auto" w:fill="FFF7E0"/>
+            <w:tcMar>
+              <w:top w:w="100" w:type="dxa"/>
+              <w:left w:w="120" w:type="dxa"/>
+              <w:bottom w:w="100" w:type="dxa"/>
+              <w:right w:w="120" w:type="dxa"/>
+            </w:tcMar>
+          </w:tcPr>
+          <w:p>
+            <w:r>
+              <w:t>201 «Producto creado.»; el listado lo muestra con precio Q8.50 y stock 40</w:t>
+            </w:r>
+          </w:p>
+        </w:tc>
+      </w:tr>
+      <w:tr>
+        <w:tblPrEx>
+          <w:tblCellMar>
+            <w:top w:w="0" w:type="dxa"/>
+            <w:bottom w:w="0" w:type="dxa"/>
+          </w:tblCellMar>
+        </w:tblPrEx>
+        <w:tc>
+          <w:tcPr>
+            <w:tcW w:w="2400" w:type="dxa"/>
+            <w:shd w:val="clear" w:color="auto" w:fill="EDEDED"/>
+            <w:tcMar>
+              <w:top w:w="100" w:type="dxa"/>
+              <w:left w:w="120" w:type="dxa"/>
+              <w:bottom w:w="100" w:type="dxa"/>
+              <w:right w:w="120" w:type="dxa"/>
+            </w:tcMar>
+          </w:tcPr>
+          <w:p>
+            <w:r>
+              <w:rPr>
+                <w:b/>
+                <w:bCs/>
+              </w:rPr>
+              <w:t>Estado de la prueba</w:t>
+            </w:r>
+          </w:p>
+        </w:tc>
+        <w:tc>
+          <w:tcPr>
+            <w:tcW w:w="6950" w:type="dxa"/>
+            <w:shd w:val="clear" w:color="auto" w:fill="FFF7E0"/>
+            <w:tcMar>
+              <w:top w:w="100" w:type="dxa"/>
+              <w:left w:w="120" w:type="dxa"/>
+              <w:bottom w:w="100" w:type="dxa"/>
+              <w:right w:w="120" w:type="dxa"/>
+            </w:tcMar>
+          </w:tcPr>
+          <w:p>
+            <w:r>
+              <w:rPr>
+                <w:b/>
+                <w:color w:val="047857"/>
+              </w:rPr>
+              <w:t>Aprobado</w:t>
+            </w:r>
+          </w:p>
+        </w:tc>
+      </w:tr>
+    </w:tbl>
+    <w:p>
+      <w:pPr>
+        <w:spacing w:after="80"/>
+      </w:pPr>
+    </w:p>
+    <w:p>
+      <w:pPr>
+        <w:spacing w:before="0" w:after="120"/>
+      </w:pPr>
+      <w:r>
+        <w:rPr>
+          <w:b/>
+          <w:sz w:val="24"/>
+        </w:rPr>
+        <w:t>Caso 7: CP-PROD-002 — Caja negra</w:t>
+      </w:r>
+    </w:p>
+    <w:tbl>
+      <w:tblPr>
+        <w:tblW w:w="9350" w:type="dxa"/>
+        <w:tblBorders>
+          <w:top w:val="single" w:sz="4" w:space="0" w:color="auto"/>
+          <w:left w:val="single" w:sz="4" w:space="0" w:color="auto"/>
+          <w:bottom w:val="single" w:sz="4" w:space="0" w:color="auto"/>
+          <w:right w:val="single" w:sz="4" w:space="0" w:color="auto"/>
+          <w:insideH w:val="single" w:sz="4" w:space="0" w:color="auto"/>
+          <w:insideV w:val="single" w:sz="4" w:space="0" w:color="auto"/>
+        </w:tblBorders>
+        <w:tblCellMar>
+          <w:left w:w="10" w:type="dxa"/>
+          <w:right w:w="10" w:type="dxa"/>
+        </w:tblCellMar>
+        <w:tblLook w:val="04A0" w:firstRow="1" w:lastRow="0" w:firstColumn="1" w:lastColumn="0" w:noHBand="0" w:noVBand="1"/>
+      </w:tblPr>
+      <w:tblGrid>
+        <w:gridCol w:w="2400"/>
+        <w:gridCol w:w="6950"/>
+      </w:tblGrid>
+      <w:tr>
+        <w:tblPrEx>
+          <w:tblCellMar>
+            <w:top w:w="0" w:type="dxa"/>
+            <w:bottom w:w="0" w:type="dxa"/>
+          </w:tblCellMar>
+        </w:tblPrEx>
+        <w:tc>
+          <w:tcPr>
+            <w:tcW w:w="2400" w:type="dxa"/>
+            <w:shd w:val="clear" w:color="auto" w:fill="EDEDED"/>
+            <w:tcMar>
+              <w:top w:w="100" w:type="dxa"/>
+              <w:left w:w="120" w:type="dxa"/>
+              <w:bottom w:w="100" w:type="dxa"/>
+              <w:right w:w="120" w:type="dxa"/>
+            </w:tcMar>
+          </w:tcPr>
+          <w:p>
+            <w:r>
+              <w:rPr>
+                <w:b/>
+                <w:bCs/>
+              </w:rPr>
+              <w:t>ID del caso de prueba</w:t>
+            </w:r>
+          </w:p>
+        </w:tc>
+        <w:tc>
+          <w:tcPr>
+            <w:tcW w:w="6950" w:type="dxa"/>
+            <w:tcMar>
+              <w:top w:w="100" w:type="dxa"/>
+              <w:left w:w="120" w:type="dxa"/>
+              <w:bottom w:w="100" w:type="dxa"/>
+              <w:right w:w="120" w:type="dxa"/>
+            </w:tcMar>
+          </w:tcPr>
+          <w:p>
+            <w:r>
+              <w:t>CP-PROD-002</w:t>
+            </w:r>
+          </w:p>
+        </w:tc>
+      </w:tr>
+      <w:tr>
+        <w:tblPrEx>
+          <w:tblCellMar>
+            <w:top w:w="0" w:type="dxa"/>
+            <w:bottom w:w="0" w:type="dxa"/>
+          </w:tblCellMar>
+        </w:tblPrEx>
+        <w:tc>
+          <w:tcPr>
+            <w:tcW w:w="2400" w:type="dxa"/>
+            <w:shd w:val="clear" w:color="auto" w:fill="EDEDED"/>
+            <w:tcMar>
+              <w:top w:w="100" w:type="dxa"/>
+              <w:left w:w="120" w:type="dxa"/>
+              <w:bottom w:w="100" w:type="dxa"/>
+              <w:right w:w="120" w:type="dxa"/>
+            </w:tcMar>
+          </w:tcPr>
+          <w:p>
+            <w:r>
+              <w:rPr>
+                <w:b/>
+                <w:bCs/>
+              </w:rPr>
+              <w:t>Escenario de prueba</w:t>
+            </w:r>
+          </w:p>
+        </w:tc>
+        <w:tc>
+          <w:tcPr>
+            <w:tcW w:w="6950" w:type="dxa"/>
+            <w:tcMar>
+              <w:top w:w="100" w:type="dxa"/>
+              <w:left w:w="120" w:type="dxa"/>
+              <w:bottom w:w="100" w:type="dxa"/>
+              <w:right w:w="120" w:type="dxa"/>
+            </w:tcMar>
+          </w:tcPr>
+          <w:p>
+            <w:r>
+              <w:t>Actualización del precio de un producto existente</w:t>
+            </w:r>
+          </w:p>
+        </w:tc>
+      </w:tr>
+      <w:tr>
+        <w:tblPrEx>
+          <w:tblCellMar>
+            <w:top w:w="0" w:type="dxa"/>
+            <w:bottom w:w="0" w:type="dxa"/>
+          </w:tblCellMar>
+        </w:tblPrEx>
+        <w:tc>
+          <w:tcPr>
+            <w:tcW w:w="2400" w:type="dxa"/>
+            <w:shd w:val="clear" w:color="auto" w:fill="EDEDED"/>
+            <w:tcMar>
+              <w:top w:w="100" w:type="dxa"/>
+              <w:left w:w="120" w:type="dxa"/>
+              <w:bottom w:w="100" w:type="dxa"/>
+              <w:right w:w="120" w:type="dxa"/>
+            </w:tcMar>
+          </w:tcPr>
+          <w:p>
+            <w:r>
+              <w:rPr>
+                <w:b/>
+                <w:bCs/>
+              </w:rPr>
+              <w:t>Pasos de la prueba</w:t>
+            </w:r>
+          </w:p>
+        </w:tc>
+        <w:tc>
+          <w:tcPr>
+            <w:tcW w:w="6950" w:type="dxa"/>
+            <w:tcMar>
+              <w:top w:w="100" w:type="dxa"/>
+              <w:left w:w="120" w:type="dxa"/>
+              <w:bottom w:w="100" w:type="dxa"/>
+              <w:right w:w="120" w:type="dxa"/>
+            </w:tcMar>
+          </w:tcPr>
+          <w:p>
+            <w:r>
+              <w:t>1. Crear un producto con precio de venta Q10.00</w:t>
+              <w:br/>
+            </w:r>
+            <w:r>
+              <w:t>2. Enviar PUT /api/productos/{id} con el nuevo precio</w:t>
+              <w:br/>
+            </w:r>
+            <w:r>
+              <w:t>3. Consultar el producto</w:t>
+            </w:r>
+          </w:p>
+        </w:tc>
+      </w:tr>
+      <w:tr>
+        <w:tblPrEx>
+          <w:tblCellMar>
+            <w:top w:w="0" w:type="dxa"/>
+            <w:bottom w:w="0" w:type="dxa"/>
+          </w:tblCellMar>
+        </w:tblPrEx>
+        <w:tc>
+          <w:tcPr>
+            <w:tcW w:w="2400" w:type="dxa"/>
+            <w:shd w:val="clear" w:color="auto" w:fill="EDEDED"/>
+            <w:tcMar>
+              <w:top w:w="100" w:type="dxa"/>
+              <w:left w:w="120" w:type="dxa"/>
+              <w:bottom w:w="100" w:type="dxa"/>
+              <w:right w:w="120" w:type="dxa"/>
+            </w:tcMar>
+          </w:tcPr>
+          <w:p>
+            <w:r>
+              <w:rPr>
+                <w:b/>
+                <w:bCs/>
+              </w:rPr>
+              <w:t>Requisitos previos</w:t>
+            </w:r>
+          </w:p>
+        </w:tc>
+        <w:tc>
+          <w:tcPr>
+            <w:tcW w:w="6950" w:type="dxa"/>
+            <w:tcMar>
+              <w:top w:w="100" w:type="dxa"/>
+              <w:left w:w="120" w:type="dxa"/>
+              <w:bottom w:w="100" w:type="dxa"/>
+              <w:right w:w="120" w:type="dxa"/>
+            </w:tcMar>
+          </w:tcPr>
+          <w:p>
+            <w:r>
+              <w:t>El producto existe en el catálogo; sesión de administrador</w:t>
+            </w:r>
+          </w:p>
+        </w:tc>
+      </w:tr>
+      <w:tr>
+        <w:tblPrEx>
+          <w:tblCellMar>
+            <w:top w:w="0" w:type="dxa"/>
+            <w:bottom w:w="0" w:type="dxa"/>
+          </w:tblCellMar>
+        </w:tblPrEx>
+        <w:tc>
+          <w:tcPr>
+            <w:tcW w:w="2400" w:type="dxa"/>
+            <w:shd w:val="clear" w:color="auto" w:fill="EDEDED"/>
+            <w:tcMar>
+              <w:top w:w="100" w:type="dxa"/>
+              <w:left w:w="120" w:type="dxa"/>
+              <w:bottom w:w="100" w:type="dxa"/>
+              <w:right w:w="120" w:type="dxa"/>
+            </w:tcMar>
+          </w:tcPr>
+          <w:p>
+            <w:r>
+              <w:rPr>
+                <w:b/>
+                <w:bCs/>
+              </w:rPr>
+              <w:t>Datos de prueba</w:t>
+            </w:r>
+          </w:p>
+        </w:tc>
+        <w:tc>
+          <w:tcPr>
+            <w:tcW w:w="6950" w:type="dxa"/>
+            <w:tcMar>
+              <w:top w:w="100" w:type="dxa"/>
+              <w:left w:w="120" w:type="dxa"/>
+              <w:bottom w:w="100" w:type="dxa"/>
+              <w:right w:w="120" w:type="dxa"/>
+            </w:tcMar>
+          </w:tcPr>
+          <w:p>
+            <w:r>
+              <w:t>precio de venta anterior: Q10.00 · precio nuevo: Q12.50</w:t>
+            </w:r>
+          </w:p>
+        </w:tc>
+      </w:tr>
+      <w:tr>
+        <w:tblPrEx>
+          <w:tblCellMar>
+            <w:top w:w="0" w:type="dxa"/>
+            <w:bottom w:w="0" w:type="dxa"/>
+          </w:tblCellMar>
+        </w:tblPrEx>
+        <w:tc>
+          <w:tcPr>
+            <w:tcW w:w="2400" w:type="dxa"/>
+            <w:shd w:val="clear" w:color="auto" w:fill="EDEDED"/>
+            <w:tcMar>
+              <w:top w:w="100" w:type="dxa"/>
+              <w:left w:w="120" w:type="dxa"/>
+              <w:bottom w:w="100" w:type="dxa"/>
+              <w:right w:w="120" w:type="dxa"/>
+            </w:tcMar>
+          </w:tcPr>
+          <w:p>
+            <w:r>
+              <w:rPr>
+                <w:b/>
+                <w:bCs/>
+              </w:rPr>
+              <w:t>Resultado esperado / previsto</w:t>
+            </w:r>
+          </w:p>
+        </w:tc>
+        <w:tc>
+          <w:tcPr>
+            <w:tcW w:w="6950" w:type="dxa"/>
+            <w:tcMar>
+              <w:top w:w="100" w:type="dxa"/>
+              <w:left w:w="120" w:type="dxa"/>
+              <w:bottom w:w="100" w:type="dxa"/>
+              <w:right w:w="120" w:type="dxa"/>
+            </w:tcMar>
+          </w:tcPr>
+          <w:p>
+            <w:r>
+              <w:t>200 OK; al consultar el producto su precio es Q12.50</w:t>
+            </w:r>
+          </w:p>
+        </w:tc>
+      </w:tr>
+      <w:tr>
+        <w:tblPrEx>
+          <w:tblCellMar>
+            <w:top w:w="0" w:type="dxa"/>
+            <w:bottom w:w="0" w:type="dxa"/>
+          </w:tblCellMar>
+        </w:tblPrEx>
+        <w:tc>
+          <w:tcPr>
+            <w:tcW w:w="2400" w:type="dxa"/>
+            <w:shd w:val="clear" w:color="auto" w:fill="EDEDED"/>
+            <w:tcMar>
+              <w:top w:w="100" w:type="dxa"/>
+              <w:left w:w="120" w:type="dxa"/>
+              <w:bottom w:w="100" w:type="dxa"/>
+              <w:right w:w="120" w:type="dxa"/>
+            </w:tcMar>
+          </w:tcPr>
+          <w:p>
+            <w:r>
+              <w:rPr>
+                <w:b/>
+                <w:bCs/>
+              </w:rPr>
+              <w:t>Resultado real</w:t>
+            </w:r>
+          </w:p>
+        </w:tc>
+        <w:tc>
+          <w:tcPr>
+            <w:tcW w:w="6950" w:type="dxa"/>
+            <w:shd w:val="clear" w:color="auto" w:fill="FFF7E0"/>
+            <w:tcMar>
+              <w:top w:w="100" w:type="dxa"/>
+              <w:left w:w="120" w:type="dxa"/>
+              <w:bottom w:w="100" w:type="dxa"/>
+              <w:right w:w="120" w:type="dxa"/>
+            </w:tcMar>
+          </w:tcPr>
+          <w:p>
+            <w:r>
+              <w:t>200 «Producto actualizado.»; el detalle devuelve precio 12.5</w:t>
+            </w:r>
+          </w:p>
+        </w:tc>
+      </w:tr>
+      <w:tr>
+        <w:tblPrEx>
+          <w:tblCellMar>
+            <w:top w:w="0" w:type="dxa"/>
+            <w:bottom w:w="0" w:type="dxa"/>
+          </w:tblCellMar>
+        </w:tblPrEx>
+        <w:tc>
+          <w:tcPr>
+            <w:tcW w:w="2400" w:type="dxa"/>
+            <w:shd w:val="clear" w:color="auto" w:fill="EDEDED"/>
+            <w:tcMar>
+              <w:top w:w="100" w:type="dxa"/>
+              <w:left w:w="120" w:type="dxa"/>
+              <w:bottom w:w="100" w:type="dxa"/>
+              <w:right w:w="120" w:type="dxa"/>
+            </w:tcMar>
+          </w:tcPr>
+          <w:p>
+            <w:r>
+              <w:rPr>
+                <w:b/>
+                <w:bCs/>
+              </w:rPr>
+              <w:t>Estado de la prueba</w:t>
+            </w:r>
+          </w:p>
+        </w:tc>
+        <w:tc>
+          <w:tcPr>
+            <w:tcW w:w="6950" w:type="dxa"/>
+            <w:shd w:val="clear" w:color="auto" w:fill="FFF7E0"/>
+            <w:tcMar>
+              <w:top w:w="100" w:type="dxa"/>
+              <w:left w:w="120" w:type="dxa"/>
+              <w:bottom w:w="100" w:type="dxa"/>
+              <w:right w:w="120" w:type="dxa"/>
+            </w:tcMar>
+          </w:tcPr>
+          <w:p>
+            <w:r>
+              <w:rPr>
+                <w:b/>
+                <w:color w:val="047857"/>
+              </w:rPr>
+              <w:t>Aprobado</w:t>
+            </w:r>
+          </w:p>
+        </w:tc>
+      </w:tr>
+    </w:tbl>
+    <w:p>
+      <w:pPr>
+        <w:spacing w:after="80"/>
+      </w:pPr>
+    </w:p>
+    <w:p>
+      <w:pPr>
+        <w:spacing w:before="0" w:after="120"/>
+      </w:pPr>
+      <w:r>
+        <w:rPr>
+          <w:b/>
+          <w:sz w:val="24"/>
+        </w:rPr>
+        <w:t>Caso 8: CP-PROD-003 — Caja negra</w:t>
+      </w:r>
+    </w:p>
+    <w:tbl>
+      <w:tblPr>
+        <w:tblW w:w="9350" w:type="dxa"/>
+        <w:tblBorders>
+          <w:top w:val="single" w:sz="4" w:space="0" w:color="auto"/>
+          <w:left w:val="single" w:sz="4" w:space="0" w:color="auto"/>
+          <w:bottom w:val="single" w:sz="4" w:space="0" w:color="auto"/>
+          <w:right w:val="single" w:sz="4" w:space="0" w:color="auto"/>
+          <w:insideH w:val="single" w:sz="4" w:space="0" w:color="auto"/>
+          <w:insideV w:val="single" w:sz="4" w:space="0" w:color="auto"/>
+        </w:tblBorders>
+        <w:tblCellMar>
+          <w:left w:w="10" w:type="dxa"/>
+          <w:right w:w="10" w:type="dxa"/>
+        </w:tblCellMar>
+        <w:tblLook w:val="04A0" w:firstRow="1" w:lastRow="0" w:firstColumn="1" w:lastColumn="0" w:noHBand="0" w:noVBand="1"/>
+      </w:tblPr>
+      <w:tblGrid>
+        <w:gridCol w:w="2400"/>
+        <w:gridCol w:w="6950"/>
+      </w:tblGrid>
+      <w:tr>
+        <w:tblPrEx>
+          <w:tblCellMar>
+            <w:top w:w="0" w:type="dxa"/>
+            <w:bottom w:w="0" w:type="dxa"/>
+          </w:tblCellMar>
+        </w:tblPrEx>
+        <w:tc>
+          <w:tcPr>
+            <w:tcW w:w="2400" w:type="dxa"/>
+            <w:shd w:val="clear" w:color="auto" w:fill="EDEDED"/>
+            <w:tcMar>
+              <w:top w:w="100" w:type="dxa"/>
+              <w:left w:w="120" w:type="dxa"/>
+              <w:bottom w:w="100" w:type="dxa"/>
+              <w:right w:w="120" w:type="dxa"/>
+            </w:tcMar>
+          </w:tcPr>
+          <w:p>
+            <w:r>
+              <w:rPr>
+                <w:b/>
+                <w:bCs/>
+              </w:rPr>
+              <w:t>ID del caso de prueba</w:t>
+            </w:r>
+          </w:p>
+        </w:tc>
+        <w:tc>
+          <w:tcPr>
+            <w:tcW w:w="6950" w:type="dxa"/>
+            <w:tcMar>
+              <w:top w:w="100" w:type="dxa"/>
+              <w:left w:w="120" w:type="dxa"/>
+              <w:bottom w:w="100" w:type="dxa"/>
+              <w:right w:w="120" w:type="dxa"/>
+            </w:tcMar>
+          </w:tcPr>
+          <w:p>
+            <w:r>
+              <w:t>CP-PROD-003</w:t>
+            </w:r>
+          </w:p>
+        </w:tc>
+      </w:tr>
+      <w:tr>
+        <w:tblPrEx>
+          <w:tblCellMar>
+            <w:top w:w="0" w:type="dxa"/>
+            <w:bottom w:w="0" w:type="dxa"/>
+          </w:tblCellMar>
+        </w:tblPrEx>
+        <w:tc>
+          <w:tcPr>
+            <w:tcW w:w="2400" w:type="dxa"/>
+            <w:shd w:val="clear" w:color="auto" w:fill="EDEDED"/>
+            <w:tcMar>
+              <w:top w:w="100" w:type="dxa"/>
+              <w:left w:w="120" w:type="dxa"/>
+              <w:bottom w:w="100" w:type="dxa"/>
+              <w:right w:w="120" w:type="dxa"/>
+            </w:tcMar>
+          </w:tcPr>
+          <w:p>
+            <w:r>
+              <w:rPr>
+                <w:b/>
+                <w:bCs/>
+              </w:rPr>
+              <w:t>Escenario de prueba</w:t>
+            </w:r>
+          </w:p>
+        </w:tc>
+        <w:tc>
+          <w:tcPr>
+            <w:tcW w:w="6950" w:type="dxa"/>
+            <w:tcMar>
+              <w:top w:w="100" w:type="dxa"/>
+              <w:left w:w="120" w:type="dxa"/>
+              <w:bottom w:w="100" w:type="dxa"/>
+              <w:right w:w="120" w:type="dxa"/>
+            </w:tcMar>
+          </w:tcPr>
+          <w:p>
+            <w:r>
+              <w:t>Eliminación de un producto del catálogo</w:t>
+            </w:r>
+          </w:p>
+        </w:tc>
+      </w:tr>
+      <w:tr>
+        <w:tblPrEx>
+          <w:tblCellMar>
+            <w:top w:w="0" w:type="dxa"/>
+            <w:bottom w:w="0" w:type="dxa"/>
+          </w:tblCellMar>
+        </w:tblPrEx>
+        <w:tc>
+          <w:tcPr>
+            <w:tcW w:w="2400" w:type="dxa"/>
+            <w:shd w:val="clear" w:color="auto" w:fill="EDEDED"/>
+            <w:tcMar>
+              <w:top w:w="100" w:type="dxa"/>
+              <w:left w:w="120" w:type="dxa"/>
+              <w:bottom w:w="100" w:type="dxa"/>
+              <w:right w:w="120" w:type="dxa"/>
+            </w:tcMar>
+          </w:tcPr>
+          <w:p>
+            <w:r>
+              <w:rPr>
+                <w:b/>
+                <w:bCs/>
+              </w:rPr>
+              <w:t>Pasos de la prueba</w:t>
+            </w:r>
+          </w:p>
+        </w:tc>
+        <w:tc>
+          <w:tcPr>
+            <w:tcW w:w="6950" w:type="dxa"/>
+            <w:tcMar>
+              <w:top w:w="100" w:type="dxa"/>
+              <w:left w:w="120" w:type="dxa"/>
+              <w:bottom w:w="100" w:type="dxa"/>
+              <w:right w:w="120" w:type="dxa"/>
+            </w:tcMar>
+          </w:tcPr>
+          <w:p>
+            <w:r>
+              <w:t>1. Crear un producto</w:t>
+              <w:br/>
+            </w:r>
+            <w:r>
+              <w:t>2. Enviar DELETE /api/productos/{id}</w:t>
+              <w:br/>
+            </w:r>
+            <w:r>
+              <w:t>3. Buscarlo en el listado</w:t>
+              <w:br/>
+            </w:r>
+            <w:r>
+              <w:t>4. Intentar venderlo</w:t>
+            </w:r>
+          </w:p>
+        </w:tc>
+      </w:tr>
+      <w:tr>
+        <w:tblPrEx>
+          <w:tblCellMar>
+            <w:top w:w="0" w:type="dxa"/>
+            <w:bottom w:w="0" w:type="dxa"/>
+          </w:tblCellMar>
+        </w:tblPrEx>
+        <w:tc>
+          <w:tcPr>
+            <w:tcW w:w="2400" w:type="dxa"/>
+            <w:shd w:val="clear" w:color="auto" w:fill="EDEDED"/>
+            <w:tcMar>
+              <w:top w:w="100" w:type="dxa"/>
+              <w:left w:w="120" w:type="dxa"/>
+              <w:bottom w:w="100" w:type="dxa"/>
+              <w:right w:w="120" w:type="dxa"/>
+            </w:tcMar>
+          </w:tcPr>
+          <w:p>
+            <w:r>
+              <w:rPr>
+                <w:b/>
+                <w:bCs/>
+              </w:rPr>
+              <w:t>Requisitos previos</w:t>
+            </w:r>
+          </w:p>
+        </w:tc>
+        <w:tc>
+          <w:tcPr>
+            <w:tcW w:w="6950" w:type="dxa"/>
+            <w:tcMar>
+              <w:top w:w="100" w:type="dxa"/>
+              <w:left w:w="120" w:type="dxa"/>
+              <w:bottom w:w="100" w:type="dxa"/>
+              <w:right w:w="120" w:type="dxa"/>
+            </w:tcMar>
+          </w:tcPr>
+          <w:p>
+            <w:r>
+              <w:t>El producto existe y está activo</w:t>
+            </w:r>
+          </w:p>
+        </w:tc>
+      </w:tr>
+      <w:tr>
+        <w:tblPrEx>
+          <w:tblCellMar>
+            <w:top w:w="0" w:type="dxa"/>
+            <w:bottom w:w="0" w:type="dxa"/>
+          </w:tblCellMar>
+        </w:tblPrEx>
+        <w:tc>
+          <w:tcPr>
+            <w:tcW w:w="2400" w:type="dxa"/>
+            <w:shd w:val="clear" w:color="auto" w:fill="EDEDED"/>
+            <w:tcMar>
+              <w:top w:w="100" w:type="dxa"/>
+              <w:left w:w="120" w:type="dxa"/>
+              <w:bottom w:w="100" w:type="dxa"/>
+              <w:right w:w="120" w:type="dxa"/>
+            </w:tcMar>
+          </w:tcPr>
+          <w:p>
+            <w:r>
+              <w:rPr>
+                <w:b/>
+                <w:bCs/>
+              </w:rPr>
+              <w:t>Datos de prueba</w:t>
+            </w:r>
+          </w:p>
+        </w:tc>
+        <w:tc>
+          <w:tcPr>
+            <w:tcW w:w="6950" w:type="dxa"/>
+            <w:tcMar>
+              <w:top w:w="100" w:type="dxa"/>
+              <w:left w:w="120" w:type="dxa"/>
+              <w:bottom w:w="100" w:type="dxa"/>
+              <w:right w:w="120" w:type="dxa"/>
+            </w:tcMar>
+          </w:tcPr>
+          <w:p>
+            <w:r>
+              <w:t>código: ELI-(único)</w:t>
+            </w:r>
+          </w:p>
+        </w:tc>
+      </w:tr>
+      <w:tr>
+        <w:tblPrEx>
+          <w:tblCellMar>
+            <w:top w:w="0" w:type="dxa"/>
+            <w:bottom w:w="0" w:type="dxa"/>
+          </w:tblCellMar>
+        </w:tblPrEx>
+        <w:tc>
+          <w:tcPr>
+            <w:tcW w:w="2400" w:type="dxa"/>
+            <w:shd w:val="clear" w:color="auto" w:fill="EDEDED"/>
+            <w:tcMar>
+              <w:top w:w="100" w:type="dxa"/>
+              <w:left w:w="120" w:type="dxa"/>
+              <w:bottom w:w="100" w:type="dxa"/>
+              <w:right w:w="120" w:type="dxa"/>
+            </w:tcMar>
+          </w:tcPr>
+          <w:p>
+            <w:r>
+              <w:rPr>
+                <w:b/>
+                <w:bCs/>
+              </w:rPr>
+              <w:t>Resultado esperado / previsto</w:t>
+            </w:r>
+          </w:p>
+        </w:tc>
+        <w:tc>
+          <w:tcPr>
+            <w:tcW w:w="6950" w:type="dxa"/>
+            <w:tcMar>
+              <w:top w:w="100" w:type="dxa"/>
+              <w:left w:w="120" w:type="dxa"/>
+              <w:bottom w:w="100" w:type="dxa"/>
+              <w:right w:w="120" w:type="dxa"/>
+            </w:tcMar>
+          </w:tcPr>
+          <w:p>
+            <w:r>
+              <w:t>200 OK; el producto ya no aparece en el listado y no se puede vender</w:t>
+            </w:r>
+          </w:p>
+        </w:tc>
+      </w:tr>
+      <w:tr>
+        <w:tblPrEx>
+          <w:tblCellMar>
+            <w:top w:w="0" w:type="dxa"/>
+            <w:bottom w:w="0" w:type="dxa"/>
+          </w:tblCellMar>
+        </w:tblPrEx>
+        <w:tc>
+          <w:tcPr>
+            <w:tcW w:w="2400" w:type="dxa"/>
+            <w:shd w:val="clear" w:color="auto" w:fill="EDEDED"/>
+            <w:tcMar>
+              <w:top w:w="100" w:type="dxa"/>
+              <w:left w:w="120" w:type="dxa"/>
+              <w:bottom w:w="100" w:type="dxa"/>
+              <w:right w:w="120" w:type="dxa"/>
+            </w:tcMar>
+          </w:tcPr>
+          <w:p>
+            <w:r>
+              <w:rPr>
+                <w:b/>
+                <w:bCs/>
+              </w:rPr>
+              <w:t>Resultado real</w:t>
+            </w:r>
+          </w:p>
+        </w:tc>
+        <w:tc>
+          <w:tcPr>
+            <w:tcW w:w="6950" w:type="dxa"/>
+            <w:shd w:val="clear" w:color="auto" w:fill="FFF7E0"/>
+            <w:tcMar>
+              <w:top w:w="100" w:type="dxa"/>
+              <w:left w:w="120" w:type="dxa"/>
+              <w:bottom w:w="100" w:type="dxa"/>
+              <w:right w:w="120" w:type="dxa"/>
+            </w:tcMar>
+          </w:tcPr>
+          <w:p>
+            <w:r>
+              <w:t>200 «Producto eliminado (baja logica).»; listado vacío; la venta responde 422 «Producto … no existe»</w:t>
+            </w:r>
+          </w:p>
+        </w:tc>
+      </w:tr>
+      <w:tr>
+        <w:tblPrEx>
+          <w:tblCellMar>
+            <w:top w:w="0" w:type="dxa"/>
+            <w:bottom w:w="0" w:type="dxa"/>
+          </w:tblCellMar>
+        </w:tblPrEx>
+        <w:tc>
+          <w:tcPr>
+            <w:tcW w:w="2400" w:type="dxa"/>
+            <w:shd w:val="clear" w:color="auto" w:fill="EDEDED"/>
+            <w:tcMar>
+              <w:top w:w="100" w:type="dxa"/>
+              <w:left w:w="120" w:type="dxa"/>
+              <w:bottom w:w="100" w:type="dxa"/>
+              <w:right w:w="120" w:type="dxa"/>
+            </w:tcMar>
+          </w:tcPr>
+          <w:p>
+            <w:r>
+              <w:rPr>
+                <w:b/>
+                <w:bCs/>
+              </w:rPr>
+              <w:t>Estado de la prueba</w:t>
+            </w:r>
+          </w:p>
+        </w:tc>
+        <w:tc>
+          <w:tcPr>
+            <w:tcW w:w="6950" w:type="dxa"/>
+            <w:shd w:val="clear" w:color="auto" w:fill="FFF7E0"/>
+            <w:tcMar>
+              <w:top w:w="100" w:type="dxa"/>
+              <w:left w:w="120" w:type="dxa"/>
+              <w:bottom w:w="100" w:type="dxa"/>
+              <w:right w:w="120" w:type="dxa"/>
+            </w:tcMar>
+          </w:tcPr>
+          <w:p>
+            <w:r>
+              <w:rPr>
+                <w:b/>
+                <w:color w:val="047857"/>
+              </w:rPr>
+              <w:t>Aprobado</w:t>
+            </w:r>
+          </w:p>
+        </w:tc>
+      </w:tr>
+    </w:tbl>
+    <w:p>
+      <w:pPr>
+        <w:spacing w:after="80"/>
+      </w:pPr>
+    </w:p>
+    <w:p>
+      <w:pPr>
+        <w:spacing w:before="0" w:after="120"/>
+      </w:pPr>
+      <w:r>
+        <w:rPr>
+          <w:b/>
+          <w:sz w:val="24"/>
+        </w:rPr>
+        <w:t>Caso 9: CP-PROD-004 — Caja blanca</w:t>
+      </w:r>
+    </w:p>
+    <w:tbl>
+      <w:tblPr>
+        <w:tblW w:w="9350" w:type="dxa"/>
+        <w:tblBorders>
+          <w:top w:val="single" w:sz="4" w:space="0" w:color="auto"/>
+          <w:left w:val="single" w:sz="4" w:space="0" w:color="auto"/>
+          <w:bottom w:val="single" w:sz="4" w:space="0" w:color="auto"/>
+          <w:right w:val="single" w:sz="4" w:space="0" w:color="auto"/>
+          <w:insideH w:val="single" w:sz="4" w:space="0" w:color="auto"/>
+          <w:insideV w:val="single" w:sz="4" w:space="0" w:color="auto"/>
+        </w:tblBorders>
+        <w:tblCellMar>
+          <w:left w:w="10" w:type="dxa"/>
+          <w:right w:w="10" w:type="dxa"/>
+        </w:tblCellMar>
+        <w:tblLook w:val="04A0" w:firstRow="1" w:lastRow="0" w:firstColumn="1" w:lastColumn="0" w:noHBand="0" w:noVBand="1"/>
+      </w:tblPr>
+      <w:tblGrid>
+        <w:gridCol w:w="2400"/>
+        <w:gridCol w:w="6950"/>
+      </w:tblGrid>
+      <w:tr>
+        <w:tblPrEx>
+          <w:tblCellMar>
+            <w:top w:w="0" w:type="dxa"/>
+            <w:bottom w:w="0" w:type="dxa"/>
+          </w:tblCellMar>
+        </w:tblPrEx>
+        <w:tc>
+          <w:tcPr>
+            <w:tcW w:w="2400" w:type="dxa"/>
+            <w:shd w:val="clear" w:color="auto" w:fill="EDEDED"/>
+            <w:tcMar>
+              <w:top w:w="100" w:type="dxa"/>
+              <w:left w:w="120" w:type="dxa"/>
+              <w:bottom w:w="100" w:type="dxa"/>
+              <w:right w:w="120" w:type="dxa"/>
+            </w:tcMar>
+          </w:tcPr>
+          <w:p>
+            <w:r>
+              <w:rPr>
+                <w:b/>
+                <w:bCs/>
+              </w:rPr>
+              <w:t>ID del caso de prueba</w:t>
+            </w:r>
+          </w:p>
+        </w:tc>
+        <w:tc>
+          <w:tcPr>
+            <w:tcW w:w="6950" w:type="dxa"/>
+            <w:tcMar>
+              <w:top w:w="100" w:type="dxa"/>
+              <w:left w:w="120" w:type="dxa"/>
+              <w:bottom w:w="100" w:type="dxa"/>
+              <w:right w:w="120" w:type="dxa"/>
+            </w:tcMar>
+          </w:tcPr>
+          <w:p>
+            <w:r>
+              <w:t>CP-PROD-004</w:t>
+            </w:r>
+          </w:p>
+        </w:tc>
+      </w:tr>
+      <w:tr>
+        <w:tblPrEx>
+          <w:tblCellMar>
+            <w:top w:w="0" w:type="dxa"/>
+            <w:bottom w:w="0" w:type="dxa"/>
+          </w:tblCellMar>
+        </w:tblPrEx>
+        <w:tc>
+          <w:tcPr>
+            <w:tcW w:w="2400" w:type="dxa"/>
+            <w:shd w:val="clear" w:color="auto" w:fill="EDEDED"/>
+            <w:tcMar>
+              <w:top w:w="100" w:type="dxa"/>
+              <w:left w:w="120" w:type="dxa"/>
+              <w:bottom w:w="100" w:type="dxa"/>
+              <w:right w:w="120" w:type="dxa"/>
+            </w:tcMar>
+          </w:tcPr>
+          <w:p>
+            <w:r>
+              <w:rPr>
+                <w:b/>
+                <w:bCs/>
+              </w:rPr>
+              <w:t>Escenario de prueba</w:t>
+            </w:r>
+          </w:p>
+        </w:tc>
+        <w:tc>
+          <w:tcPr>
+            <w:tcW w:w="6950" w:type="dxa"/>
+            <w:tcMar>
+              <w:top w:w="100" w:type="dxa"/>
+              <w:left w:w="120" w:type="dxa"/>
+              <w:bottom w:w="100" w:type="dxa"/>
+              <w:right w:w="120" w:type="dxa"/>
+            </w:tcMar>
+          </w:tcPr>
+          <w:p>
+            <w:r>
+              <w:t>Intento de registrar un producto con campos obligatorios vacíos o inválidos</w:t>
+            </w:r>
+          </w:p>
+        </w:tc>
+      </w:tr>
+      <w:tr>
+        <w:tblPrEx>
+          <w:tblCellMar>
+            <w:top w:w="0" w:type="dxa"/>
+            <w:bottom w:w="0" w:type="dxa"/>
+          </w:tblCellMar>
+        </w:tblPrEx>
+        <w:tc>
+          <w:tcPr>
+            <w:tcW w:w="2400" w:type="dxa"/>
+            <w:shd w:val="clear" w:color="auto" w:fill="EDEDED"/>
+            <w:tcMar>
+              <w:top w:w="100" w:type="dxa"/>
+              <w:left w:w="120" w:type="dxa"/>
+              <w:bottom w:w="100" w:type="dxa"/>
+              <w:right w:w="120" w:type="dxa"/>
+            </w:tcMar>
+          </w:tcPr>
+          <w:p>
+            <w:r>
+              <w:rPr>
+                <w:b/>
+                <w:bCs/>
+              </w:rPr>
+              <w:t>Pasos de la prueba</w:t>
+            </w:r>
+          </w:p>
+        </w:tc>
+        <w:tc>
+          <w:tcPr>
+            <w:tcW w:w="6950" w:type="dxa"/>
+            <w:tcMar>
+              <w:top w:w="100" w:type="dxa"/>
+              <w:left w:w="120" w:type="dxa"/>
+              <w:bottom w:w="100" w:type="dxa"/>
+              <w:right w:w="120" w:type="dxa"/>
+            </w:tcMar>
+          </w:tcPr>
+          <w:p>
+            <w:r>
+              <w:t>1. Leer api_productos_create() en app/controllers/productos.php e identificar sus 4 ramas de rechazo</w:t>
+              <w:br/>
+            </w:r>
+            <w:r>
+              <w:t>2. Enviar un POST por cada rama</w:t>
+              <w:br/>
+            </w:r>
+            <w:r>
+              <w:t>3. Verificar el código, el mensaje y que no se guardó nada</w:t>
+            </w:r>
+          </w:p>
+        </w:tc>
+      </w:tr>
+      <w:tr>
+        <w:tblPrEx>
+          <w:tblCellMar>
+            <w:top w:w="0" w:type="dxa"/>
+            <w:bottom w:w="0" w:type="dxa"/>
+          </w:tblCellMar>
+        </w:tblPrEx>
+        <w:tc>
+          <w:tcPr>
+            <w:tcW w:w="2400" w:type="dxa"/>
+            <w:shd w:val="clear" w:color="auto" w:fill="EDEDED"/>
+            <w:tcMar>
+              <w:top w:w="100" w:type="dxa"/>
+              <w:left w:w="120" w:type="dxa"/>
+              <w:bottom w:w="100" w:type="dxa"/>
+              <w:right w:w="120" w:type="dxa"/>
+            </w:tcMar>
+          </w:tcPr>
+          <w:p>
+            <w:r>
+              <w:rPr>
+                <w:b/>
+                <w:bCs/>
+              </w:rPr>
+              <w:t>Requisitos previos</w:t>
+            </w:r>
+          </w:p>
+        </w:tc>
+        <w:tc>
+          <w:tcPr>
+            <w:tcW w:w="6950" w:type="dxa"/>
+            <w:tcMar>
+              <w:top w:w="100" w:type="dxa"/>
+              <w:left w:w="120" w:type="dxa"/>
+              <w:bottom w:w="100" w:type="dxa"/>
+              <w:right w:w="120" w:type="dxa"/>
+            </w:tcMar>
+          </w:tcPr>
+          <w:p>
+            <w:r>
+              <w:t>Sesión de administrador; formulario/endpoint de nuevo producto</w:t>
+            </w:r>
+          </w:p>
+        </w:tc>
+      </w:tr>
+      <w:tr>
+        <w:tblPrEx>
+          <w:tblCellMar>
+            <w:top w:w="0" w:type="dxa"/>
+            <w:bottom w:w="0" w:type="dxa"/>
+          </w:tblCellMar>
+        </w:tblPrEx>
+        <w:tc>
+          <w:tcPr>
+            <w:tcW w:w="2400" w:type="dxa"/>
+            <w:shd w:val="clear" w:color="auto" w:fill="EDEDED"/>
+            <w:tcMar>
+              <w:top w:w="100" w:type="dxa"/>
+              <w:left w:w="120" w:type="dxa"/>
+              <w:bottom w:w="100" w:type="dxa"/>
+              <w:right w:w="120" w:type="dxa"/>
+            </w:tcMar>
+          </w:tcPr>
+          <w:p>
+            <w:r>
+              <w:rPr>
+                <w:b/>
+                <w:bCs/>
+              </w:rPr>
+              <w:t>Datos de prueba</w:t>
+            </w:r>
+          </w:p>
+        </w:tc>
+        <w:tc>
+          <w:tcPr>
+            <w:tcW w:w="6950" w:type="dxa"/>
+            <w:tcMar>
+              <w:top w:w="100" w:type="dxa"/>
+              <w:left w:w="120" w:type="dxa"/>
+              <w:bottom w:w="100" w:type="dxa"/>
+              <w:right w:w="120" w:type="dxa"/>
+            </w:tcMar>
+          </w:tcPr>
+          <w:p>
+            <w:r>
+              <w:t>Rama 1: código vacío / nombre con solo espacios</w:t>
+              <w:br/>
+            </w:r>
+            <w:r>
+              <w:t>Rama 2: sin precio de compra / precio de venta vacío</w:t>
+              <w:br/>
+            </w:r>
+            <w:r>
+              <w:t>Rama 3: precio de compra −1 / precio de venta «diez»</w:t>
+              <w:br/>
+            </w:r>
+            <w:r>
+              <w:t>Rama 4: código ya registrado</w:t>
+            </w:r>
+          </w:p>
+        </w:tc>
+      </w:tr>
+      <w:tr>
+        <w:tblPrEx>
+          <w:tblCellMar>
+            <w:top w:w="0" w:type="dxa"/>
+            <w:bottom w:w="0" w:type="dxa"/>
+          </w:tblCellMar>
+        </w:tblPrEx>
+        <w:tc>
+          <w:tcPr>
+            <w:tcW w:w="2400" w:type="dxa"/>
+            <w:shd w:val="clear" w:color="auto" w:fill="EDEDED"/>
+            <w:tcMar>
+              <w:top w:w="100" w:type="dxa"/>
+              <w:left w:w="120" w:type="dxa"/>
+              <w:bottom w:w="100" w:type="dxa"/>
+              <w:right w:w="120" w:type="dxa"/>
+            </w:tcMar>
+          </w:tcPr>
+          <w:p>
+            <w:r>
+              <w:rPr>
+                <w:b/>
+                <w:bCs/>
+              </w:rPr>
+              <w:t>Resultado esperado / previsto</w:t>
+            </w:r>
+          </w:p>
+        </w:tc>
+        <w:tc>
+          <w:tcPr>
+            <w:tcW w:w="6950" w:type="dxa"/>
+            <w:tcMar>
+              <w:top w:w="100" w:type="dxa"/>
+              <w:left w:w="120" w:type="dxa"/>
+              <w:bottom w:w="100" w:type="dxa"/>
+              <w:right w:w="120" w:type="dxa"/>
+            </w:tcMar>
+          </w:tcPr>
+          <w:p>
+            <w:r>
+              <w:t>Ramas 1–3: 422 con el mensaje de validación de cada rama, sin guardar el producto</w:t>
+              <w:br/>
+            </w:r>
+            <w:r>
+              <w:t>Rama 4: 409 «Ya existe un producto con ese codigo»</w:t>
+            </w:r>
+          </w:p>
+        </w:tc>
+      </w:tr>
+      <w:tr>
+        <w:tblPrEx>
+          <w:tblCellMar>
+            <w:top w:w="0" w:type="dxa"/>
+            <w:bottom w:w="0" w:type="dxa"/>
+          </w:tblCellMar>
+        </w:tblPrEx>
+        <w:tc>
+          <w:tcPr>
+            <w:tcW w:w="2400" w:type="dxa"/>
+            <w:shd w:val="clear" w:color="auto" w:fill="EDEDED"/>
+            <w:tcMar>
+              <w:top w:w="100" w:type="dxa"/>
+              <w:left w:w="120" w:type="dxa"/>
+              <w:bottom w:w="100" w:type="dxa"/>
+              <w:right w:w="120" w:type="dxa"/>
+            </w:tcMar>
+          </w:tcPr>
+          <w:p>
+            <w:r>
+              <w:rPr>
+                <w:b/>
+                <w:bCs/>
+              </w:rPr>
+              <w:t>Resultado real</w:t>
+            </w:r>
+          </w:p>
+        </w:tc>
+        <w:tc>
+          <w:tcPr>
+            <w:tcW w:w="6950" w:type="dxa"/>
+            <w:shd w:val="clear" w:color="auto" w:fill="FFF7E0"/>
+            <w:tcMar>
+              <w:top w:w="100" w:type="dxa"/>
+              <w:left w:w="120" w:type="dxa"/>
+              <w:bottom w:w="100" w:type="dxa"/>
+              <w:right w:w="120" w:type="dxa"/>
+            </w:tcMar>
+          </w:tcPr>
+          <w:p>
+            <w:r>
+              <w:t>Rama 1: 422 «Codigo y nombre son obligatorios.»</w:t>
+              <w:br/>
+            </w:r>
+            <w:r>
+              <w:t>Rama 2: 422 «El precio de compra y el precio de venta son obligatorios.»</w:t>
+              <w:br/>
+            </w:r>
+            <w:r>
+              <w:t>Rama 3: 422 «El precio de … debe ser un numero mayor o igual a 0.»</w:t>
+              <w:br/>
+            </w:r>
+            <w:r>
+              <w:t>Rama 4: 409 «Ya existe un producto con ese codigo.»</w:t>
+              <w:br/>
+            </w:r>
+            <w:r>
+              <w:t>En ningún caso quedó guardado (7 de 7 verificaciones)</w:t>
+            </w:r>
+          </w:p>
+        </w:tc>
+      </w:tr>
+      <w:tr>
+        <w:tblPrEx>
+          <w:tblCellMar>
+            <w:top w:w="0" w:type="dxa"/>
+            <w:bottom w:w="0" w:type="dxa"/>
+          </w:tblCellMar>
+        </w:tblPrEx>
+        <w:tc>
+          <w:tcPr>
+            <w:tcW w:w="2400" w:type="dxa"/>
+            <w:shd w:val="clear" w:color="auto" w:fill="EDEDED"/>
+            <w:tcMar>
+              <w:top w:w="100" w:type="dxa"/>
+              <w:left w:w="120" w:type="dxa"/>
+              <w:bottom w:w="100" w:type="dxa"/>
+              <w:right w:w="120" w:type="dxa"/>
+            </w:tcMar>
+          </w:tcPr>
+          <w:p>
+            <w:r>
+              <w:rPr>
+                <w:b/>
+                <w:bCs/>
+              </w:rPr>
+              <w:t>Estado de la prueba</w:t>
+            </w:r>
+          </w:p>
+        </w:tc>
+        <w:tc>
+          <w:tcPr>
+            <w:tcW w:w="6950" w:type="dxa"/>
+            <w:shd w:val="clear" w:color="auto" w:fill="FFF7E0"/>
+            <w:tcMar>
+              <w:top w:w="100" w:type="dxa"/>
+              <w:left w:w="120" w:type="dxa"/>
+              <w:bottom w:w="100" w:type="dxa"/>
+              <w:right w:w="120" w:type="dxa"/>
+            </w:tcMar>
+          </w:tcPr>
+          <w:p>
+            <w:r>
+              <w:rPr>
+                <w:b/>
+                <w:color w:val="047857"/>
+              </w:rPr>
+              <w:t>Aprobado</w:t>
+            </w:r>
+          </w:p>
+        </w:tc>
+      </w:tr>
+    </w:tbl>
+    <w:p>
+      <w:pPr>
+        <w:spacing w:after="80"/>
+      </w:pPr>
+    </w:p>
+    <w:p>
+      <w:pPr>
+        <w:spacing w:before="0" w:after="120"/>
+      </w:pPr>
+      <w:r>
+        <w:rPr>
+          <w:b/>
+          <w:sz w:val="24"/>
+        </w:rPr>
+        <w:t>Caso 10: CP-PROD-005 — Caja gris</w:t>
       </w:r>
     </w:p>
     <w:tbl>
@@ -3573,7 +6026,7 @@
           <w:b/>
           <w:sz w:val="24"/>
         </w:rPr>
-        <w:t>Caso 6: CP-GAN-001 — Caja blanca</w:t>
+        <w:t>Caso 11: CP-GAN-001 — Caja blanca</w:t>
       </w:r>
     </w:p>
     <w:tbl>
@@ -3986,7 +6439,7 @@
           <w:b/>
           <w:sz w:val="24"/>
         </w:rPr>
-        <w:t>Caso 7: CP-GAN-002 — Caja negra</w:t>
+        <w:t>Caso 12: CP-GAN-002 — Caja negra</w:t>
       </w:r>
     </w:p>
     <w:tbl>
@@ -4399,7 +6852,7 @@
           <w:b/>
           <w:sz w:val="24"/>
         </w:rPr>
-        <w:t>Caso 8: CP-GAN-003 — Caja blanca</w:t>
+        <w:t>Caso 13: CP-GAN-003 — Caja blanca</w:t>
       </w:r>
     </w:p>
     <w:tbl>
@@ -4812,7 +7265,7 @@
           <w:b/>
           <w:sz w:val="24"/>
         </w:rPr>
-        <w:t>Caso 9: CP-GAN-004 — Caja gris</w:t>
+        <w:t>Caso 14: CP-GAN-004 — Caja gris</w:t>
       </w:r>
     </w:p>
     <w:tbl>
@@ -5353,6 +7806,73 @@
               <w:rPr>
                 <w:sz w:val="18"/>
               </w:rPr>
+              <w:t>Módulo 1 · Autenticación</w:t>
+            </w:r>
+          </w:p>
+        </w:tc>
+        <w:tc>
+          <w:tcPr>
+            <w:tcW w:type="dxa" w:w="907"/>
+          </w:tcPr>
+          <w:p>
+            <w:r>
+              <w:rPr>
+                <w:sz w:val="18"/>
+              </w:rPr>
+              <w:t>5</w:t>
+            </w:r>
+          </w:p>
+        </w:tc>
+        <w:tc>
+          <w:tcPr>
+            <w:tcW w:type="dxa" w:w="1474"/>
+          </w:tcPr>
+          <w:p>
+            <w:r>
+              <w:rPr>
+                <w:sz w:val="18"/>
+              </w:rPr>
+              <w:t>5</w:t>
+            </w:r>
+          </w:p>
+        </w:tc>
+        <w:tc>
+          <w:tcPr>
+            <w:tcW w:type="dxa" w:w="1701"/>
+          </w:tcPr>
+          <w:p>
+            <w:r>
+              <w:rPr>
+                <w:sz w:val="18"/>
+              </w:rPr>
+              <w:t>5 / 5</w:t>
+            </w:r>
+          </w:p>
+        </w:tc>
+        <w:tc>
+          <w:tcPr>
+            <w:tcW w:type="dxa" w:w="2268"/>
+          </w:tcPr>
+          <w:p>
+            <w:r>
+              <w:rPr>
+                <w:sz w:val="18"/>
+              </w:rPr>
+              <w:t>Negra</w:t>
+            </w:r>
+          </w:p>
+        </w:tc>
+      </w:tr>
+      <w:tr>
+        <w:tc>
+          <w:tcPr>
+            <w:tcW w:type="dxa" w:w="3175"/>
+          </w:tcPr>
+          <w:p>
+            <w:r>
+              <w:rPr>
+                <w:sz w:val="18"/>
+              </w:rPr>
               <w:t>Módulo 2 · Gestión de Productos</w:t>
             </w:r>
           </w:p>
@@ -5473,73 +7993,6 @@
                 <w:sz w:val="18"/>
               </w:rPr>
               <w:t>Negra, blanca y gris</w:t>
-            </w:r>
-          </w:p>
-        </w:tc>
-      </w:tr>
-      <w:tr>
-        <w:tc>
-          <w:tcPr>
-            <w:tcW w:type="dxa" w:w="3175"/>
-          </w:tcPr>
-          <w:p>
-            <w:r>
-              <w:rPr>
-                <w:sz w:val="18"/>
-              </w:rPr>
-              <w:t>Módulo 1 · Autenticación (regresión)</w:t>
-            </w:r>
-          </w:p>
-        </w:tc>
-        <w:tc>
-          <w:tcPr>
-            <w:tcW w:type="dxa" w:w="907"/>
-          </w:tcPr>
-          <w:p>
-            <w:r>
-              <w:rPr>
-                <w:sz w:val="18"/>
-              </w:rPr>
-              <w:t>5</w:t>
-            </w:r>
-          </w:p>
-        </w:tc>
-        <w:tc>
-          <w:tcPr>
-            <w:tcW w:type="dxa" w:w="1474"/>
-          </w:tcPr>
-          <w:p>
-            <w:r>
-              <w:rPr>
-                <w:sz w:val="18"/>
-              </w:rPr>
-              <w:t>5</w:t>
-            </w:r>
-          </w:p>
-        </w:tc>
-        <w:tc>
-          <w:tcPr>
-            <w:tcW w:type="dxa" w:w="1701"/>
-          </w:tcPr>
-          <w:p>
-            <w:r>
-              <w:rPr>
-                <w:sz w:val="18"/>
-              </w:rPr>
-              <w:t>5 / 5</w:t>
-            </w:r>
-          </w:p>
-        </w:tc>
-        <w:tc>
-          <w:tcPr>
-            <w:tcW w:type="dxa" w:w="2268"/>
-          </w:tcPr>
-          <w:p>
-            <w:r>
-              <w:rPr>
-                <w:sz w:val="18"/>
-              </w:rPr>
-              <w:t>Negra</w:t>
             </w:r>
           </w:p>
         </w:tc>
@@ -5663,7 +8116,7 @@
         <w:spacing w:before="0" w:after="120"/>
       </w:pPr>
       <w:r>
-        <w:t>Los módulos de Gestión de Productos y Cálculo de Ganancias cumplen los criterios de aceptación: 100 % de casos aprobados, combinando pruebas de caja negra (requerimientos), caja blanca (ramas y fórmulas del código) y caja gris (diseño de datos y roles).</w:t>
+        <w:t>Los módulos de Autenticación, Gestión de Productos y Cálculo de Ganancias cumplen los criterios de aceptación: 100 % de casos aprobados, combinando pruebas de caja negra (requerimientos), caja blanca (ramas y fórmulas del código) y caja gris (diseño de datos y roles).</w:t>
       </w:r>
     </w:p>
     <w:sectPr>

</xml_diff>